<commit_message>
feat: Complete inspection app with backend, admin web, and Flutter app
- Backend API with Node.js/Express
- Admin web dashboard with Next.js
- Flutter mobile app
- Docker configuration
- Ngrok integration
</commit_message>
<xml_diff>
--- a/inspection-app-back-end/templates/template.docx
+++ b/inspection-app-back-end/templates/template.docx
@@ -728,6 +728,7 @@
             <w:cnfStyle w:val="001000000000" w:firstRow="0" w:lastRow="0" w:firstColumn="1" w:lastColumn="0" w:oddVBand="0" w:evenVBand="0" w:oddHBand="0" w:evenHBand="0" w:firstRowFirstColumn="0" w:firstRowLastColumn="0" w:lastRowFirstColumn="0" w:lastRowLastColumn="0"/>
             <w:tcW w:w="407" w:type="dxa"/>
             <w:shd w:val="clear" w:color="auto" w:fill="2F75B5"/>
+            <w:tcMar/>
           </w:tcPr>
           <w:p>
             <w:pPr>
@@ -743,8 +744,10 @@
         </w:tc>
         <w:tc>
           <w:tcPr>
+            <w:cnfStyle w:val="000000000000" w:firstRow="0" w:lastRow="0" w:firstColumn="0" w:lastColumn="0" w:oddVBand="0" w:evenVBand="0" w:oddHBand="0" w:evenHBand="0" w:firstRowFirstColumn="0" w:firstRowLastColumn="0" w:lastRowFirstColumn="0" w:lastRowLastColumn="0"/>
             <w:tcW w:w="1552" w:type="dxa"/>
             <w:shd w:val="clear" w:color="auto" w:fill="2F75B5"/>
+            <w:tcMar/>
           </w:tcPr>
           <w:p>
             <w:pPr>
@@ -779,8 +782,10 @@
         </w:tc>
         <w:tc>
           <w:tcPr>
+            <w:cnfStyle w:val="000000000000" w:firstRow="0" w:lastRow="0" w:firstColumn="0" w:lastColumn="0" w:oddVBand="0" w:evenVBand="0" w:oddHBand="0" w:evenHBand="0" w:firstRowFirstColumn="0" w:firstRowLastColumn="0" w:lastRowFirstColumn="0" w:lastRowLastColumn="0"/>
             <w:tcW w:w="2289" w:type="dxa"/>
             <w:shd w:val="clear" w:color="auto" w:fill="2F75B5"/>
+            <w:tcMar/>
           </w:tcPr>
           <w:p>
             <w:pPr>
@@ -799,8 +804,10 @@
         </w:tc>
         <w:tc>
           <w:tcPr>
+            <w:cnfStyle w:val="000000000000" w:firstRow="0" w:lastRow="0" w:firstColumn="0" w:lastColumn="0" w:oddVBand="0" w:evenVBand="0" w:oddHBand="0" w:evenHBand="0" w:firstRowFirstColumn="0" w:firstRowLastColumn="0" w:lastRowFirstColumn="0" w:lastRowLastColumn="0"/>
             <w:tcW w:w="5130" w:type="dxa"/>
             <w:shd w:val="clear" w:color="auto" w:fill="2F75B5"/>
+            <w:tcMar/>
           </w:tcPr>
           <w:p>
             <w:pPr>
@@ -832,16 +839,20 @@
           <w:tcPr>
             <w:cnfStyle w:val="001000000000" w:firstRow="0" w:lastRow="0" w:firstColumn="1" w:lastColumn="0" w:oddVBand="0" w:evenVBand="0" w:oddHBand="0" w:evenHBand="0" w:firstRowFirstColumn="0" w:firstRowLastColumn="0" w:lastRowFirstColumn="0" w:lastRowLastColumn="0"/>
             <w:tcW w:w="407" w:type="dxa"/>
+            <w:tcMar/>
           </w:tcPr>
           <w:p>
             <w:r>
+              <w:rPr/>
               <w:t>1</w:t>
             </w:r>
           </w:p>
         </w:tc>
         <w:tc>
           <w:tcPr>
+            <w:cnfStyle w:val="000000000000" w:firstRow="0" w:lastRow="0" w:firstColumn="0" w:lastColumn="0" w:oddVBand="0" w:evenVBand="0" w:oddHBand="0" w:evenHBand="0" w:firstRowFirstColumn="0" w:firstRowLastColumn="0" w:lastRowFirstColumn="0" w:lastRowLastColumn="0"/>
             <w:tcW w:w="1552" w:type="dxa"/>
+            <w:tcMar/>
           </w:tcPr>
           <w:p>
             <w:pPr>
@@ -849,7 +860,7 @@
             </w:pPr>
             <w:proofErr w:type="spellStart"/>
             <w:r>
-              <w:t>Мэдрэгчийн</w:t>
+              <w:t>Тавцангийн</w:t>
             </w:r>
             <w:proofErr w:type="spellEnd"/>
             <w:r>
@@ -857,14 +868,16 @@
             </w:r>
             <w:proofErr w:type="spellStart"/>
             <w:r>
-              <w:t>суурь</w:t>
+              <w:t>лист</w:t>
             </w:r>
             <w:proofErr w:type="spellEnd"/>
           </w:p>
         </w:tc>
         <w:tc>
           <w:tcPr>
+            <w:cnfStyle w:val="000000000000" w:firstRow="0" w:lastRow="0" w:firstColumn="0" w:lastColumn="0" w:oddVBand="0" w:evenVBand="0" w:oddHBand="0" w:evenHBand="0" w:firstRowFirstColumn="0" w:firstRowLastColumn="0" w:lastRowFirstColumn="0" w:lastRowLastColumn="0"/>
             <w:tcW w:w="2289" w:type="dxa"/>
+            <w:tcMar/>
           </w:tcPr>
           <w:p>
             <w:pPr>
@@ -882,11 +895,11 @@
             </w:r>
             <w:proofErr w:type="gramEnd"/>
             <w:r>
-              <w:t>.sensor_</w:t>
+              <w:t>.platform_</w:t>
             </w:r>
             <w:proofErr w:type="gramStart"/>
             <w:r>
-              <w:t>base.</w:t>
+              <w:t>plate.</w:t>
             </w:r>
             <w:r>
               <w:t>status</w:t>
@@ -902,7 +915,9 @@
         </w:tc>
         <w:tc>
           <w:tcPr>
+            <w:cnfStyle w:val="000000000000" w:firstRow="0" w:lastRow="0" w:firstColumn="0" w:lastColumn="0" w:oddVBand="0" w:evenVBand="0" w:oddHBand="0" w:evenHBand="0" w:firstRowFirstColumn="0" w:firstRowLastColumn="0" w:lastRowFirstColumn="0" w:lastRowLastColumn="0"/>
             <w:tcW w:w="5130" w:type="dxa"/>
+            <w:tcMar/>
           </w:tcPr>
           <w:p>
             <w:pPr>
@@ -920,11 +935,11 @@
             </w:r>
             <w:proofErr w:type="gramEnd"/>
             <w:r>
-              <w:t>.sensor_</w:t>
+              <w:t>.platform_</w:t>
             </w:r>
             <w:proofErr w:type="gramStart"/>
             <w:r>
-              <w:t>base.</w:t>
+              <w:t>plate.</w:t>
             </w:r>
             <w:r>
               <w:t>comment</w:t>
@@ -947,16 +962,20 @@
           <w:tcPr>
             <w:cnfStyle w:val="001000000000" w:firstRow="0" w:lastRow="0" w:firstColumn="1" w:lastColumn="0" w:oddVBand="0" w:evenVBand="0" w:oddHBand="0" w:evenHBand="0" w:firstRowFirstColumn="0" w:firstRowLastColumn="0" w:lastRowFirstColumn="0" w:lastRowLastColumn="0"/>
             <w:tcW w:w="407" w:type="dxa"/>
+            <w:tcMar/>
           </w:tcPr>
           <w:p>
             <w:r>
+              <w:rPr/>
               <w:t>2</w:t>
             </w:r>
           </w:p>
         </w:tc>
         <w:tc>
           <w:tcPr>
+            <w:cnfStyle w:val="000000000000" w:firstRow="0" w:lastRow="0" w:firstColumn="0" w:lastColumn="0" w:oddVBand="0" w:evenVBand="0" w:oddHBand="0" w:evenHBand="0" w:firstRowFirstColumn="0" w:firstRowLastColumn="0" w:lastRowFirstColumn="0" w:lastRowLastColumn="0"/>
             <w:tcW w:w="1552" w:type="dxa"/>
+            <w:tcMar/>
           </w:tcPr>
           <w:p>
             <w:pPr>
@@ -975,11 +994,29 @@
               <w:t>нуруу</w:t>
             </w:r>
             <w:proofErr w:type="spellEnd"/>
+            <w:r>
+              <w:t xml:space="preserve"> </w:t>
+            </w:r>
+            <w:proofErr w:type="spellStart"/>
+            <w:r>
+              <w:t>холбосон</w:t>
+            </w:r>
+            <w:proofErr w:type="spellEnd"/>
+            <w:r>
+              <w:t xml:space="preserve"> </w:t>
+            </w:r>
+            <w:proofErr w:type="spellStart"/>
+            <w:r>
+              <w:t>лист</w:t>
+            </w:r>
+            <w:proofErr w:type="spellEnd"/>
           </w:p>
         </w:tc>
         <w:tc>
           <w:tcPr>
+            <w:cnfStyle w:val="000000000000" w:firstRow="0" w:lastRow="0" w:firstColumn="0" w:lastColumn="0" w:oddVBand="0" w:evenVBand="0" w:oddHBand="0" w:evenHBand="0" w:firstRowFirstColumn="0" w:firstRowLastColumn="0" w:lastRowFirstColumn="0" w:lastRowLastColumn="0"/>
             <w:tcW w:w="2289" w:type="dxa"/>
+            <w:tcMar/>
           </w:tcPr>
           <w:p>
             <w:pPr>
@@ -997,11 +1034,11 @@
             </w:r>
             <w:proofErr w:type="gramEnd"/>
             <w:r>
-              <w:t>.</w:t>
+              <w:t>.beam_joint_</w:t>
             </w:r>
             <w:proofErr w:type="gramStart"/>
             <w:r>
-              <w:t>beam.</w:t>
+              <w:t>plate.</w:t>
             </w:r>
             <w:r>
               <w:t>status</w:t>
@@ -1017,7 +1054,9 @@
         </w:tc>
         <w:tc>
           <w:tcPr>
+            <w:cnfStyle w:val="000000000000" w:firstRow="0" w:lastRow="0" w:firstColumn="0" w:lastColumn="0" w:oddVBand="0" w:evenVBand="0" w:oddHBand="0" w:evenHBand="0" w:firstRowFirstColumn="0" w:firstRowLastColumn="0" w:lastRowFirstColumn="0" w:lastRowLastColumn="0"/>
             <w:tcW w:w="5130" w:type="dxa"/>
+            <w:tcMar/>
           </w:tcPr>
           <w:p>
             <w:pPr>
@@ -1035,11 +1074,11 @@
             </w:r>
             <w:proofErr w:type="gramEnd"/>
             <w:r>
-              <w:t>.</w:t>
+              <w:t>.beam_joint_</w:t>
             </w:r>
             <w:proofErr w:type="gramStart"/>
             <w:r>
-              <w:t>beam.</w:t>
+              <w:t>plate.</w:t>
             </w:r>
             <w:r>
               <w:t>comment</w:t>
@@ -1062,16 +1101,20 @@
           <w:tcPr>
             <w:cnfStyle w:val="001000000000" w:firstRow="0" w:lastRow="0" w:firstColumn="1" w:lastColumn="0" w:oddVBand="0" w:evenVBand="0" w:oddHBand="0" w:evenHBand="0" w:firstRowFirstColumn="0" w:firstRowLastColumn="0" w:lastRowFirstColumn="0" w:lastRowLastColumn="0"/>
             <w:tcW w:w="407" w:type="dxa"/>
+            <w:tcMar/>
           </w:tcPr>
           <w:p>
             <w:r>
+              <w:rPr/>
               <w:t>3</w:t>
             </w:r>
           </w:p>
         </w:tc>
         <w:tc>
           <w:tcPr>
+            <w:cnfStyle w:val="000000000000" w:firstRow="0" w:lastRow="0" w:firstColumn="0" w:lastColumn="0" w:oddVBand="0" w:evenVBand="0" w:oddHBand="0" w:evenHBand="0" w:firstRowFirstColumn="0" w:firstRowLastColumn="0" w:lastRowFirstColumn="0" w:lastRowLastColumn="0"/>
             <w:tcW w:w="1552" w:type="dxa"/>
+            <w:tcMar/>
           </w:tcPr>
           <w:p>
             <w:pPr>
@@ -1079,7 +1122,7 @@
             </w:pPr>
             <w:proofErr w:type="spellStart"/>
             <w:r>
-              <w:t>Тавцангийн</w:t>
+              <w:t>Хязгаарлагчийн</w:t>
             </w:r>
             <w:proofErr w:type="spellEnd"/>
             <w:r>
@@ -1087,14 +1130,16 @@
             </w:r>
             <w:proofErr w:type="spellStart"/>
             <w:r>
-              <w:t>лист</w:t>
+              <w:t>боолт</w:t>
             </w:r>
             <w:proofErr w:type="spellEnd"/>
           </w:p>
         </w:tc>
         <w:tc>
           <w:tcPr>
+            <w:cnfStyle w:val="000000000000" w:firstRow="0" w:lastRow="0" w:firstColumn="0" w:lastColumn="0" w:oddVBand="0" w:evenVBand="0" w:oddHBand="0" w:evenHBand="0" w:firstRowFirstColumn="0" w:firstRowLastColumn="0" w:lastRowFirstColumn="0" w:lastRowLastColumn="0"/>
             <w:tcW w:w="2289" w:type="dxa"/>
+            <w:tcMar/>
           </w:tcPr>
           <w:p>
             <w:pPr>
@@ -1112,11 +1157,14 @@
             </w:r>
             <w:proofErr w:type="gramEnd"/>
             <w:r>
-              <w:t>.platform_</w:t>
+              <w:t>.sto</w:t>
+            </w:r>
+            <w:r>
+              <w:t>p_</w:t>
             </w:r>
             <w:proofErr w:type="gramStart"/>
             <w:r>
-              <w:t>plate.</w:t>
+              <w:t>bolt.</w:t>
             </w:r>
             <w:r>
               <w:t>status</w:t>
@@ -1132,7 +1180,9 @@
         </w:tc>
         <w:tc>
           <w:tcPr>
+            <w:cnfStyle w:val="000000000000" w:firstRow="0" w:lastRow="0" w:firstColumn="0" w:lastColumn="0" w:oddVBand="0" w:evenVBand="0" w:oddHBand="0" w:evenHBand="0" w:firstRowFirstColumn="0" w:firstRowLastColumn="0" w:lastRowFirstColumn="0" w:lastRowLastColumn="0"/>
             <w:tcW w:w="5130" w:type="dxa"/>
+            <w:tcMar/>
           </w:tcPr>
           <w:p>
             <w:pPr>
@@ -1150,11 +1200,11 @@
             </w:r>
             <w:proofErr w:type="gramEnd"/>
             <w:r>
-              <w:t>.platform_</w:t>
+              <w:t>.stop_</w:t>
             </w:r>
             <w:proofErr w:type="gramStart"/>
             <w:r>
-              <w:t>plate.</w:t>
+              <w:t>bolt.</w:t>
             </w:r>
             <w:r>
               <w:t>comment</w:t>
@@ -1177,16 +1227,20 @@
           <w:tcPr>
             <w:cnfStyle w:val="001000000000" w:firstRow="0" w:lastRow="0" w:firstColumn="1" w:lastColumn="0" w:oddVBand="0" w:evenVBand="0" w:oddHBand="0" w:evenHBand="0" w:firstRowFirstColumn="0" w:firstRowLastColumn="0" w:lastRowFirstColumn="0" w:lastRowLastColumn="0"/>
             <w:tcW w:w="407" w:type="dxa"/>
+            <w:tcMar/>
           </w:tcPr>
           <w:p>
             <w:r>
+              <w:rPr/>
               <w:t>4</w:t>
             </w:r>
           </w:p>
         </w:tc>
         <w:tc>
           <w:tcPr>
+            <w:cnfStyle w:val="000000000000" w:firstRow="0" w:lastRow="0" w:firstColumn="0" w:lastColumn="0" w:oddVBand="0" w:evenVBand="0" w:oddHBand="0" w:evenHBand="0" w:firstRowFirstColumn="0" w:firstRowLastColumn="0" w:lastRowFirstColumn="0" w:lastRowLastColumn="0"/>
             <w:tcW w:w="1552" w:type="dxa"/>
+            <w:tcMar/>
           </w:tcPr>
           <w:p>
             <w:pPr>
@@ -1194,7 +1248,7 @@
             </w:pPr>
             <w:proofErr w:type="spellStart"/>
             <w:r>
-              <w:t>Дам</w:t>
+              <w:t>Тавцан</w:t>
             </w:r>
             <w:proofErr w:type="spellEnd"/>
             <w:r>
@@ -1202,7 +1256,7 @@
             </w:r>
             <w:proofErr w:type="spellStart"/>
             <w:r>
-              <w:t>нуруу</w:t>
+              <w:t>хоорондын</w:t>
             </w:r>
             <w:proofErr w:type="spellEnd"/>
             <w:r>
@@ -1210,22 +1264,16 @@
             </w:r>
             <w:proofErr w:type="spellStart"/>
             <w:r>
-              <w:t>холбосон</w:t>
-            </w:r>
-            <w:proofErr w:type="spellEnd"/>
-            <w:r>
-              <w:t xml:space="preserve"> </w:t>
-            </w:r>
-            <w:proofErr w:type="spellStart"/>
-            <w:r>
-              <w:t>лист</w:t>
+              <w:t>боолт</w:t>
             </w:r>
             <w:proofErr w:type="spellEnd"/>
           </w:p>
         </w:tc>
         <w:tc>
           <w:tcPr>
+            <w:cnfStyle w:val="000000000000" w:firstRow="0" w:lastRow="0" w:firstColumn="0" w:lastColumn="0" w:oddVBand="0" w:evenVBand="0" w:oddHBand="0" w:evenHBand="0" w:firstRowFirstColumn="0" w:firstRowLastColumn="0" w:lastRowFirstColumn="0" w:lastRowLastColumn="0"/>
             <w:tcW w:w="2289" w:type="dxa"/>
+            <w:tcMar/>
           </w:tcPr>
           <w:p>
             <w:pPr>
@@ -1243,11 +1291,11 @@
             </w:r>
             <w:proofErr w:type="gramEnd"/>
             <w:r>
-              <w:t>.beam_joint_</w:t>
+              <w:t>.interplatform_</w:t>
             </w:r>
             <w:proofErr w:type="gramStart"/>
             <w:r>
-              <w:t>plate.</w:t>
+              <w:t>bolts.</w:t>
             </w:r>
             <w:r>
               <w:t>status</w:t>
@@ -1263,7 +1311,9 @@
         </w:tc>
         <w:tc>
           <w:tcPr>
+            <w:cnfStyle w:val="000000000000" w:firstRow="0" w:lastRow="0" w:firstColumn="0" w:lastColumn="0" w:oddVBand="0" w:evenVBand="0" w:oddHBand="0" w:evenHBand="0" w:firstRowFirstColumn="0" w:firstRowLastColumn="0" w:lastRowFirstColumn="0" w:lastRowLastColumn="0"/>
             <w:tcW w:w="5130" w:type="dxa"/>
+            <w:tcMar/>
           </w:tcPr>
           <w:p>
             <w:pPr>
@@ -1281,247 +1331,6 @@
             </w:r>
             <w:proofErr w:type="gramEnd"/>
             <w:r>
-              <w:t>.beam_joint_</w:t>
-            </w:r>
-            <w:proofErr w:type="gramStart"/>
-            <w:r>
-              <w:t>plate.</w:t>
-            </w:r>
-            <w:r>
-              <w:t>comment</w:t>
-            </w:r>
-            <w:proofErr w:type="gramEnd"/>
-            <w:r>
-              <w:t>}</w:t>
-            </w:r>
-            <w:r>
-              <w:t>}</w:t>
-            </w:r>
-          </w:p>
-        </w:tc>
-      </w:tr>
-      <w:tr>
-        <w:trPr>
-          <w:cnfStyle w:val="000000100000" w:firstRow="0" w:lastRow="0" w:firstColumn="0" w:lastColumn="0" w:oddVBand="0" w:evenVBand="0" w:oddHBand="1" w:evenHBand="0" w:firstRowFirstColumn="0" w:firstRowLastColumn="0" w:lastRowFirstColumn="0" w:lastRowLastColumn="0"/>
-        </w:trPr>
-        <w:tc>
-          <w:tcPr>
-            <w:cnfStyle w:val="001000000000" w:firstRow="0" w:lastRow="0" w:firstColumn="1" w:lastColumn="0" w:oddVBand="0" w:evenVBand="0" w:oddHBand="0" w:evenHBand="0" w:firstRowFirstColumn="0" w:firstRowLastColumn="0" w:lastRowFirstColumn="0" w:lastRowLastColumn="0"/>
-            <w:tcW w:w="407" w:type="dxa"/>
-          </w:tcPr>
-          <w:p>
-            <w:r>
-              <w:t>5</w:t>
-            </w:r>
-          </w:p>
-        </w:tc>
-        <w:tc>
-          <w:tcPr>
-            <w:tcW w:w="1552" w:type="dxa"/>
-          </w:tcPr>
-          <w:p>
-            <w:pPr>
-              <w:cnfStyle w:val="000000100000" w:firstRow="0" w:lastRow="0" w:firstColumn="0" w:lastColumn="0" w:oddVBand="0" w:evenVBand="0" w:oddHBand="1" w:evenHBand="0" w:firstRowFirstColumn="0" w:firstRowLastColumn="0" w:lastRowFirstColumn="0" w:lastRowLastColumn="0"/>
-            </w:pPr>
-            <w:proofErr w:type="spellStart"/>
-            <w:r>
-              <w:t>Хязгаарлагчийн</w:t>
-            </w:r>
-            <w:proofErr w:type="spellEnd"/>
-            <w:r>
-              <w:t xml:space="preserve"> </w:t>
-            </w:r>
-            <w:proofErr w:type="spellStart"/>
-            <w:r>
-              <w:t>боолт</w:t>
-            </w:r>
-            <w:proofErr w:type="spellEnd"/>
-          </w:p>
-        </w:tc>
-        <w:tc>
-          <w:tcPr>
-            <w:tcW w:w="2289" w:type="dxa"/>
-          </w:tcPr>
-          <w:p>
-            <w:pPr>
-              <w:cnfStyle w:val="000000100000" w:firstRow="0" w:lastRow="0" w:firstColumn="0" w:lastColumn="0" w:oddVBand="0" w:evenVBand="0" w:oddHBand="1" w:evenHBand="0" w:firstRowFirstColumn="0" w:firstRowLastColumn="0" w:lastRowFirstColumn="0" w:lastRowLastColumn="0"/>
-            </w:pPr>
-            <w:r>
-              <w:t>{</w:t>
-            </w:r>
-            <w:r>
-              <w:t>{</w:t>
-            </w:r>
-            <w:proofErr w:type="gramStart"/>
-            <w:r>
-              <w:t>d.exterior</w:t>
-            </w:r>
-            <w:proofErr w:type="gramEnd"/>
-            <w:r>
-              <w:t>.sto</w:t>
-            </w:r>
-            <w:r>
-              <w:t>p_</w:t>
-            </w:r>
-            <w:proofErr w:type="gramStart"/>
-            <w:r>
-              <w:t>bolt.</w:t>
-            </w:r>
-            <w:r>
-              <w:t>status</w:t>
-            </w:r>
-            <w:proofErr w:type="gramEnd"/>
-            <w:r>
-              <w:t>}</w:t>
-            </w:r>
-            <w:r>
-              <w:t>}</w:t>
-            </w:r>
-          </w:p>
-        </w:tc>
-        <w:tc>
-          <w:tcPr>
-            <w:tcW w:w="5130" w:type="dxa"/>
-          </w:tcPr>
-          <w:p>
-            <w:pPr>
-              <w:cnfStyle w:val="000000100000" w:firstRow="0" w:lastRow="0" w:firstColumn="0" w:lastColumn="0" w:oddVBand="0" w:evenVBand="0" w:oddHBand="1" w:evenHBand="0" w:firstRowFirstColumn="0" w:firstRowLastColumn="0" w:lastRowFirstColumn="0" w:lastRowLastColumn="0"/>
-            </w:pPr>
-            <w:r>
-              <w:t>{</w:t>
-            </w:r>
-            <w:r>
-              <w:t>{</w:t>
-            </w:r>
-            <w:proofErr w:type="gramStart"/>
-            <w:r>
-              <w:t>d.exterior</w:t>
-            </w:r>
-            <w:proofErr w:type="gramEnd"/>
-            <w:r>
-              <w:t>.stop_</w:t>
-            </w:r>
-            <w:proofErr w:type="gramStart"/>
-            <w:r>
-              <w:t>bolt.</w:t>
-            </w:r>
-            <w:r>
-              <w:t>comment</w:t>
-            </w:r>
-            <w:proofErr w:type="gramEnd"/>
-            <w:r>
-              <w:t>}</w:t>
-            </w:r>
-            <w:r>
-              <w:t>}</w:t>
-            </w:r>
-          </w:p>
-        </w:tc>
-      </w:tr>
-      <w:tr>
-        <w:trPr>
-          <w:cnfStyle w:val="000000010000" w:firstRow="0" w:lastRow="0" w:firstColumn="0" w:lastColumn="0" w:oddVBand="0" w:evenVBand="0" w:oddHBand="0" w:evenHBand="1" w:firstRowFirstColumn="0" w:firstRowLastColumn="0" w:lastRowFirstColumn="0" w:lastRowLastColumn="0"/>
-        </w:trPr>
-        <w:tc>
-          <w:tcPr>
-            <w:cnfStyle w:val="001000000000" w:firstRow="0" w:lastRow="0" w:firstColumn="1" w:lastColumn="0" w:oddVBand="0" w:evenVBand="0" w:oddHBand="0" w:evenHBand="0" w:firstRowFirstColumn="0" w:firstRowLastColumn="0" w:lastRowFirstColumn="0" w:lastRowLastColumn="0"/>
-            <w:tcW w:w="407" w:type="dxa"/>
-          </w:tcPr>
-          <w:p>
-            <w:r>
-              <w:t>6</w:t>
-            </w:r>
-          </w:p>
-        </w:tc>
-        <w:tc>
-          <w:tcPr>
-            <w:tcW w:w="1552" w:type="dxa"/>
-          </w:tcPr>
-          <w:p>
-            <w:pPr>
-              <w:cnfStyle w:val="000000010000" w:firstRow="0" w:lastRow="0" w:firstColumn="0" w:lastColumn="0" w:oddVBand="0" w:evenVBand="0" w:oddHBand="0" w:evenHBand="1" w:firstRowFirstColumn="0" w:firstRowLastColumn="0" w:lastRowFirstColumn="0" w:lastRowLastColumn="0"/>
-            </w:pPr>
-            <w:proofErr w:type="spellStart"/>
-            <w:r>
-              <w:t>Тавцан</w:t>
-            </w:r>
-            <w:proofErr w:type="spellEnd"/>
-            <w:r>
-              <w:t xml:space="preserve"> </w:t>
-            </w:r>
-            <w:proofErr w:type="spellStart"/>
-            <w:r>
-              <w:t>хоорондын</w:t>
-            </w:r>
-            <w:proofErr w:type="spellEnd"/>
-            <w:r>
-              <w:t xml:space="preserve"> </w:t>
-            </w:r>
-            <w:proofErr w:type="spellStart"/>
-            <w:r>
-              <w:t>боолт</w:t>
-            </w:r>
-            <w:proofErr w:type="spellEnd"/>
-          </w:p>
-        </w:tc>
-        <w:tc>
-          <w:tcPr>
-            <w:tcW w:w="2289" w:type="dxa"/>
-          </w:tcPr>
-          <w:p>
-            <w:pPr>
-              <w:cnfStyle w:val="000000010000" w:firstRow="0" w:lastRow="0" w:firstColumn="0" w:lastColumn="0" w:oddVBand="0" w:evenVBand="0" w:oddHBand="0" w:evenHBand="1" w:firstRowFirstColumn="0" w:firstRowLastColumn="0" w:lastRowFirstColumn="0" w:lastRowLastColumn="0"/>
-            </w:pPr>
-            <w:r>
-              <w:t>{</w:t>
-            </w:r>
-            <w:r>
-              <w:t>{</w:t>
-            </w:r>
-            <w:proofErr w:type="gramStart"/>
-            <w:r>
-              <w:t>d.exterior</w:t>
-            </w:r>
-            <w:proofErr w:type="gramEnd"/>
-            <w:r>
-              <w:t>.interplatform_</w:t>
-            </w:r>
-            <w:proofErr w:type="gramStart"/>
-            <w:r>
-              <w:t>bolts.</w:t>
-            </w:r>
-            <w:r>
-              <w:t>status</w:t>
-            </w:r>
-            <w:proofErr w:type="gramEnd"/>
-            <w:r>
-              <w:t>}</w:t>
-            </w:r>
-            <w:r>
-              <w:t>}</w:t>
-            </w:r>
-          </w:p>
-        </w:tc>
-        <w:tc>
-          <w:tcPr>
-            <w:tcW w:w="5130" w:type="dxa"/>
-          </w:tcPr>
-          <w:p>
-            <w:pPr>
-              <w:cnfStyle w:val="000000010000" w:firstRow="0" w:lastRow="0" w:firstColumn="0" w:lastColumn="0" w:oddVBand="0" w:evenVBand="0" w:oddHBand="0" w:evenHBand="1" w:firstRowFirstColumn="0" w:firstRowLastColumn="0" w:lastRowFirstColumn="0" w:lastRowLastColumn="0"/>
-            </w:pPr>
-            <w:r>
-              <w:t>{</w:t>
-            </w:r>
-            <w:r>
-              <w:t>{</w:t>
-            </w:r>
-            <w:proofErr w:type="gramStart"/>
-            <w:r>
-              <w:t>d.exterior</w:t>
-            </w:r>
-            <w:proofErr w:type="gramEnd"/>
-            <w:r>
               <w:t>.interplatform_</w:t>
             </w:r>
             <w:proofErr w:type="gramStart"/>
@@ -1542,339 +1351,6 @@
         </w:tc>
       </w:tr>
     </w:tbl>
-    <w:p>
-      <w:pPr>
-        <w:rPr>
-          <w:lang w:val="fr-FR"/>
-        </w:rPr>
-      </w:pPr>
-      <w:r>
-        <w:rPr>
-          <w:lang w:val="fr-FR"/>
-        </w:rPr>
-        <w:t>{{#</w:t>
-      </w:r>
-      <w:proofErr w:type="gramStart"/>
-      <w:r>
-        <w:rPr>
-          <w:lang w:val="fr-FR"/>
-        </w:rPr>
-        <w:t>d.hasImages.exterior</w:t>
-      </w:r>
-      <w:proofErr w:type="gramEnd"/>
-      <w:r>
-        <w:rPr>
-          <w:lang w:val="fr-FR"/>
-        </w:rPr>
-        <w:t>.sensor_base}}</w:t>
-      </w:r>
-    </w:p>
-    <w:p>
-      <w:pPr>
-        <w:shd w:val="clear" w:color="auto" w:fill="FFFFFF" w:themeFill="background1"/>
-        <w:rPr>
-          <w:lang w:val="fr-FR"/>
-        </w:rPr>
-      </w:pPr>
-      <w:r>
-        <w:rPr>
-          <w:lang w:val="fr-FR"/>
-        </w:rPr>
-        <w:t xml:space="preserve">Мэдрэгчийн </w:t>
-      </w:r>
-      <w:proofErr w:type="gramStart"/>
-      <w:r>
-        <w:rPr>
-          <w:lang w:val="fr-FR"/>
-        </w:rPr>
-        <w:t>суурь:</w:t>
-      </w:r>
-      <w:proofErr w:type="gramEnd"/>
-    </w:p>
-    <w:p>
-      <w:pPr>
-        <w:rPr>
-          <w:lang w:val="fr-FR"/>
-        </w:rPr>
-      </w:pPr>
-      <w:r>
-        <w:t>{{#</w:t>
-      </w:r>
-      <w:proofErr w:type="gramStart"/>
-      <w:r>
-        <w:t>d.images</w:t>
-      </w:r>
-      <w:proofErr w:type="gramEnd"/>
-      <w:r>
-        <w:t>.</w:t>
-      </w:r>
-      <w:proofErr w:type="gramStart"/>
-      <w:r>
-        <w:t>exterior.sensor</w:t>
-      </w:r>
-      <w:proofErr w:type="gramEnd"/>
-      <w:r>
-        <w:t>_base}}</w:t>
-      </w:r>
-    </w:p>
-    <w:p w14:noSpellErr="1">
-      <w:r>
-        <w:drawing>
-          <wp:inline wp14:editId="0FFCEEE4" wp14:anchorId="472FDBE9">
-            <wp:extent cx="2143125" cy="2143125"/>
-            <wp:effectExtent l="0" t="0" r="9525" b="9525"/>
-            <wp:docPr id="829094576" name="Picture 1" descr="{{image}}"/>
-            <wp:cNvGraphicFramePr>
-              <a:graphicFrameLocks noChangeAspect="1"/>
-            </wp:cNvGraphicFramePr>
-            <a:graphic>
-              <a:graphicData xmlns:a="http://schemas.openxmlformats.org/drawingml/2006/main" uri="http://schemas.openxmlformats.org/drawingml/2006/picture">
-                <pic:pic xmlns:pic="http://schemas.openxmlformats.org/drawingml/2006/picture">
-                  <pic:nvPicPr>
-                    <pic:cNvPr id="829094576" name="Picture 1" descr="image"/>
-                    <pic:cNvPicPr/>
-                  </pic:nvPicPr>
-                  <pic:blipFill>
-                    <a:blip xmlns:r="http://schemas.openxmlformats.org/officeDocument/2006/relationships" r:embed="rId9"/>
-                    <a:stretch>
-                      <a:fillRect/>
-                    </a:stretch>
-                  </pic:blipFill>
-                  <pic:spPr>
-                    <a:xfrm>
-                      <a:off x="0" y="0"/>
-                      <a:ext cx="2143125" cy="2143125"/>
-                    </a:xfrm>
-                    <a:prstGeom prst="rect">
-                      <a:avLst/>
-                    </a:prstGeom>
-                  </pic:spPr>
-                </pic:pic>
-              </a:graphicData>
-            </a:graphic>
-          </wp:inline>
-        </w:drawing>
-      </w:r>
-    </w:p>
-    <w:p>
-      <w:r>
-        <w:t>{{/</w:t>
-      </w:r>
-      <w:proofErr w:type="gramStart"/>
-      <w:r>
-        <w:t>d.images</w:t>
-      </w:r>
-      <w:proofErr w:type="gramEnd"/>
-      <w:r>
-        <w:t>.</w:t>
-      </w:r>
-      <w:proofErr w:type="gramStart"/>
-      <w:r>
-        <w:t>exterior.sensor</w:t>
-      </w:r>
-      <w:proofErr w:type="gramEnd"/>
-      <w:r>
-        <w:t>_base}}</w:t>
-      </w:r>
-    </w:p>
-    <w:p>
-      <w:r>
-        <w:t>{{/</w:t>
-      </w:r>
-      <w:proofErr w:type="gramStart"/>
-      <w:r>
-        <w:t>d.hasImages.exterior</w:t>
-      </w:r>
-      <w:proofErr w:type="gramEnd"/>
-      <w:r>
-        <w:t>.sensor_base}}</w:t>
-      </w:r>
-    </w:p>
-    <w:p>
-      <w:pPr>
-        <w:spacing w:before="240" w:after="240"/>
-      </w:pPr>
-      <w:r>
-        <w:rPr>
-          <w:rFonts w:ascii="Cambria" w:hAnsi="Cambria" w:eastAsia="Cambria" w:cs="Cambria"/>
-        </w:rPr>
-        <w:t>{{#</w:t>
-      </w:r>
-      <w:proofErr w:type="gramStart"/>
-      <w:r>
-        <w:rPr>
-          <w:rFonts w:ascii="Cambria" w:hAnsi="Cambria" w:eastAsia="Cambria" w:cs="Cambria"/>
-        </w:rPr>
-        <w:t>d.hasImages.exterior</w:t>
-      </w:r>
-      <w:proofErr w:type="gramEnd"/>
-      <w:r>
-        <w:rPr>
-          <w:rFonts w:ascii="Cambria" w:hAnsi="Cambria" w:eastAsia="Cambria" w:cs="Cambria"/>
-        </w:rPr>
-        <w:t>.beam}}</w:t>
-      </w:r>
-    </w:p>
-    <w:p>
-      <w:pPr>
-        <w:spacing w:before="240" w:after="240"/>
-      </w:pPr>
-      <w:r>
-        <w:rPr>
-          <w:rFonts w:ascii="Cambria" w:hAnsi="Cambria" w:eastAsia="Cambria" w:cs="Cambria"/>
-        </w:rPr>
-        <w:t>Дам нуруу:</w:t>
-      </w:r>
-    </w:p>
-    <w:p>
-      <w:pPr>
-        <w:spacing w:before="240" w:after="240"/>
-      </w:pPr>
-      <w:r>
-        <w:rPr>
-          <w:rFonts w:ascii="Cambria" w:hAnsi="Cambria" w:eastAsia="Cambria" w:cs="Cambria"/>
-        </w:rPr>
-        <w:t>{{#</w:t>
-      </w:r>
-      <w:proofErr w:type="gramStart"/>
-      <w:r>
-        <w:rPr>
-          <w:rFonts w:ascii="Cambria" w:hAnsi="Cambria" w:eastAsia="Cambria" w:cs="Cambria"/>
-        </w:rPr>
-        <w:t>d.images</w:t>
-      </w:r>
-      <w:proofErr w:type="gramEnd"/>
-      <w:r>
-        <w:rPr>
-          <w:rFonts w:ascii="Cambria" w:hAnsi="Cambria" w:eastAsia="Cambria" w:cs="Cambria"/>
-        </w:rPr>
-        <w:t>.</w:t>
-      </w:r>
-      <w:proofErr w:type="gramStart"/>
-      <w:r>
-        <w:rPr>
-          <w:rFonts w:ascii="Cambria" w:hAnsi="Cambria" w:eastAsia="Cambria" w:cs="Cambria"/>
-        </w:rPr>
-        <w:t>exterior.beam</w:t>
-      </w:r>
-      <w:proofErr w:type="gramEnd"/>
-      <w:r>
-        <w:rPr>
-          <w:rFonts w:ascii="Cambria" w:hAnsi="Cambria" w:eastAsia="Cambria" w:cs="Cambria"/>
-        </w:rPr>
-        <w:t>}}</w:t>
-      </w:r>
-    </w:p>
-    <w:p>
-      <w:pPr>
-        <w:pStyle w:val="Normal"/>
-        <w:spacing w:before="240" w:after="240"/>
-      </w:pPr>
-      <w:r>
-        <w:drawing>
-          <wp:inline wp14:editId="2B1660D8" wp14:anchorId="7F29DADE">
-            <wp:extent cx="2143125" cy="2143125"/>
-            <wp:effectExtent l="0" t="0" r="9525" b="9525"/>
-            <wp:docPr id="703669309" name="Picture 1" descr="{{image}}"/>
-            <wp:cNvGraphicFramePr>
-              <a:graphicFrameLocks noChangeAspect="1"/>
-            </wp:cNvGraphicFramePr>
-            <a:graphic>
-              <a:graphicData xmlns:a="http://schemas.openxmlformats.org/drawingml/2006/main" uri="http://schemas.openxmlformats.org/drawingml/2006/picture">
-                <pic:pic xmlns:pic="http://schemas.openxmlformats.org/drawingml/2006/picture">
-                  <pic:nvPicPr>
-                    <pic:cNvPr id="829094576" name="Picture 1" descr="image"/>
-                    <pic:cNvPicPr/>
-                  </pic:nvPicPr>
-                  <pic:blipFill>
-                    <a:blip xmlns:r="http://schemas.openxmlformats.org/officeDocument/2006/relationships" r:embed="rId9"/>
-                    <a:stretch>
-                      <a:fillRect/>
-                    </a:stretch>
-                  </pic:blipFill>
-                  <pic:spPr>
-                    <a:xfrm>
-                      <a:off x="0" y="0"/>
-                      <a:ext cx="2143125" cy="2143125"/>
-                    </a:xfrm>
-                    <a:prstGeom prst="rect">
-                      <a:avLst/>
-                    </a:prstGeom>
-                  </pic:spPr>
-                </pic:pic>
-              </a:graphicData>
-            </a:graphic>
-          </wp:inline>
-        </w:drawing>
-      </w:r>
-    </w:p>
-    <w:p>
-      <w:pPr>
-        <w:spacing w:before="240" w:after="240"/>
-      </w:pPr>
-      <w:r>
-        <w:rPr>
-          <w:rFonts w:ascii="Cambria" w:hAnsi="Cambria" w:eastAsia="Cambria" w:cs="Cambria"/>
-        </w:rPr>
-        <w:t>{{/</w:t>
-      </w:r>
-      <w:proofErr w:type="gramStart"/>
-      <w:r>
-        <w:rPr>
-          <w:rFonts w:ascii="Cambria" w:hAnsi="Cambria" w:eastAsia="Cambria" w:cs="Cambria"/>
-        </w:rPr>
-        <w:t>d.images</w:t>
-      </w:r>
-      <w:proofErr w:type="gramEnd"/>
-      <w:r>
-        <w:rPr>
-          <w:rFonts w:ascii="Cambria" w:hAnsi="Cambria" w:eastAsia="Cambria" w:cs="Cambria"/>
-        </w:rPr>
-        <w:t>.</w:t>
-      </w:r>
-      <w:proofErr w:type="gramStart"/>
-      <w:r>
-        <w:rPr>
-          <w:rFonts w:ascii="Cambria" w:hAnsi="Cambria" w:eastAsia="Cambria" w:cs="Cambria"/>
-        </w:rPr>
-        <w:t>exterior.beam</w:t>
-      </w:r>
-      <w:proofErr w:type="gramEnd"/>
-      <w:r>
-        <w:rPr>
-          <w:rFonts w:ascii="Cambria" w:hAnsi="Cambria" w:eastAsia="Cambria" w:cs="Cambria"/>
-        </w:rPr>
-        <w:t>}}</w:t>
-      </w:r>
-    </w:p>
-    <w:p>
-      <w:pPr>
-        <w:spacing w:before="240" w:after="240"/>
-        <w:rPr>
-          <w:rFonts w:ascii="Cambria" w:hAnsi="Cambria" w:eastAsia="Cambria" w:cs="Cambria"/>
-        </w:rPr>
-      </w:pPr>
-      <w:r>
-        <w:rPr>
-          <w:rFonts w:ascii="Cambria" w:hAnsi="Cambria" w:eastAsia="Cambria" w:cs="Cambria"/>
-        </w:rPr>
-        <w:t>{{/</w:t>
-      </w:r>
-      <w:proofErr w:type="gramStart"/>
-      <w:r>
-        <w:rPr>
-          <w:rFonts w:ascii="Cambria" w:hAnsi="Cambria" w:eastAsia="Cambria" w:cs="Cambria"/>
-        </w:rPr>
-        <w:t>d.hasImages.exterior</w:t>
-      </w:r>
-      <w:proofErr w:type="gramEnd"/>
-      <w:r>
-        <w:rPr>
-          <w:rFonts w:ascii="Cambria" w:hAnsi="Cambria" w:eastAsia="Cambria" w:cs="Cambria"/>
-        </w:rPr>
-        <w:t>.beam}}</w:t>
-      </w:r>
-    </w:p>
     <w:p>
       <w:pPr>
         <w:spacing w:before="240" w:after="240"/>
@@ -3545,6 +3021,93 @@
           </w:p>
         </w:tc>
       </w:tr>
+      <w:tr>
+        <w:trPr>
+          <w:cnfStyle w:val="000000010000" w:firstRow="0" w:lastRow="0" w:firstColumn="0" w:lastColumn="0" w:oddVBand="0" w:evenVBand="0" w:oddHBand="0" w:evenHBand="1" w:firstRowFirstColumn="0" w:firstRowLastColumn="0" w:lastRowFirstColumn="0" w:lastRowLastColumn="0"/>
+          <w:trHeight w:val="300"/>
+        </w:trPr>
+        <w:tc>
+          <w:tcPr>
+            <w:cnfStyle w:val="001000000000" w:firstRow="0" w:lastRow="0" w:firstColumn="1" w:lastColumn="0" w:oddVBand="0" w:evenVBand="0" w:oddHBand="0" w:evenHBand="0" w:firstRowFirstColumn="0" w:firstRowLastColumn="0" w:lastRowFirstColumn="0" w:lastRowLastColumn="0"/>
+            <w:tcW w:w="405" w:type="dxa"/>
+            <w:tcMar/>
+          </w:tcPr>
+          <w:p>
+            <w:pPr>
+              <w:pStyle w:val="Normal"/>
+            </w:pPr>
+            <w:r>
+              <w:rPr/>
+              <w:t>7</w:t>
+            </w:r>
+          </w:p>
+        </w:tc>
+        <w:tc>
+          <w:tcPr>
+            <w:cnfStyle w:val="000000000000" w:firstRow="0" w:lastRow="0" w:firstColumn="0" w:lastColumn="0" w:oddVBand="0" w:evenVBand="0" w:oddHBand="0" w:evenHBand="0" w:firstRowFirstColumn="0" w:firstRowLastColumn="0" w:lastRowFirstColumn="0" w:lastRowLastColumn="0"/>
+            <w:tcW w:w="1593" w:type="dxa"/>
+            <w:tcMar/>
+          </w:tcPr>
+          <w:p>
+            <w:pPr>
+              <w:pStyle w:val="Normal"/>
+            </w:pPr>
+            <w:r>
+              <w:rPr/>
+              <w:t>Батарей</w:t>
+            </w:r>
+          </w:p>
+        </w:tc>
+        <w:tc>
+          <w:tcPr>
+            <w:cnfStyle w:val="000000000000" w:firstRow="0" w:lastRow="0" w:firstColumn="0" w:lastColumn="0" w:oddVBand="0" w:evenVBand="0" w:oddHBand="0" w:evenHBand="0" w:firstRowFirstColumn="0" w:firstRowLastColumn="0" w:lastRowFirstColumn="0" w:lastRowLastColumn="0"/>
+            <w:tcW w:w="2250" w:type="dxa"/>
+            <w:tcMar/>
+          </w:tcPr>
+          <w:p>
+            <w:r>
+              <w:rPr/>
+              <w:t>{{</w:t>
+            </w:r>
+            <w:r>
+              <w:rPr/>
+              <w:t>d.indicator.battery.status</w:t>
+            </w:r>
+            <w:r>
+              <w:rPr/>
+              <w:t>}}</w:t>
+            </w:r>
+          </w:p>
+          <w:p>
+            <w:pPr>
+              <w:pStyle w:val="Normal"/>
+            </w:pPr>
+          </w:p>
+        </w:tc>
+        <w:tc>
+          <w:tcPr>
+            <w:cnfStyle w:val="000000000000" w:firstRow="0" w:lastRow="0" w:firstColumn="0" w:lastColumn="0" w:oddVBand="0" w:evenVBand="0" w:oddHBand="0" w:evenHBand="0" w:firstRowFirstColumn="0" w:firstRowLastColumn="0" w:lastRowFirstColumn="0" w:lastRowLastColumn="0"/>
+            <w:tcW w:w="5130" w:type="dxa"/>
+            <w:tcMar/>
+          </w:tcPr>
+          <w:p>
+            <w:r>
+              <w:rPr/>
+              <w:t>{{d.indicator.battery.comment}}</w:t>
+            </w:r>
+          </w:p>
+          <w:p>
+            <w:pPr>
+              <w:pStyle w:val="Normal"/>
+            </w:pPr>
+          </w:p>
+          <w:p>
+            <w:pPr>
+              <w:pStyle w:val="Normal"/>
+            </w:pPr>
+          </w:p>
+        </w:tc>
+      </w:tr>
     </w:tbl>
     <w:p>
       <w:pPr>
@@ -4623,40 +4186,247 @@
         <w:t>}}</w:t>
       </w:r>
     </w:p>
+    <w:p w14:noSpellErr="1">
+      <w:pPr>
+        <w:spacing w:before="240" w:after="240"/>
+      </w:pPr>
+      <w:r>
+        <w:rPr>
+          <w:rFonts w:ascii="Cambria" w:hAnsi="Cambria" w:eastAsia="Cambria" w:cs="Cambria"/>
+        </w:rPr>
+        <w:t xml:space="preserve"> {{/</w:t>
+      </w:r>
+      <w:r>
+        <w:rPr>
+          <w:rFonts w:ascii="Cambria" w:hAnsi="Cambria" w:eastAsia="Cambria" w:cs="Cambria"/>
+        </w:rPr>
+        <w:t>d.hasImages.indicator</w:t>
+      </w:r>
+      <w:r>
+        <w:rPr>
+          <w:rFonts w:ascii="Cambria" w:hAnsi="Cambria" w:eastAsia="Cambria" w:cs="Cambria"/>
+        </w:rPr>
+        <w:t>.</w:t>
+      </w:r>
+      <w:r>
+        <w:rPr>
+          <w:rFonts w:ascii="Cambria" w:hAnsi="Cambria" w:eastAsia="Cambria" w:cs="Cambria"/>
+        </w:rPr>
+        <w:t>serial</w:t>
+      </w:r>
+      <w:r>
+        <w:rPr>
+          <w:rFonts w:ascii="Cambria" w:hAnsi="Cambria" w:eastAsia="Cambria" w:cs="Cambria"/>
+        </w:rPr>
+        <w:t>_converter</w:t>
+      </w:r>
+      <w:r>
+        <w:rPr>
+          <w:rFonts w:ascii="Cambria" w:hAnsi="Cambria" w:eastAsia="Cambria" w:cs="Cambria"/>
+        </w:rPr>
+        <w:t>}}</w:t>
+      </w:r>
+    </w:p>
     <w:p>
       <w:pPr>
+        <w:pStyle w:val="Normal"/>
         <w:spacing w:before="240" w:after="240"/>
       </w:pPr>
       <w:r>
         <w:rPr>
           <w:rFonts w:ascii="Cambria" w:hAnsi="Cambria" w:eastAsia="Cambria" w:cs="Cambria"/>
         </w:rPr>
+        <w:t>{{#</w:t>
+      </w:r>
+      <w:r>
+        <w:rPr>
+          <w:rFonts w:ascii="Cambria" w:hAnsi="Cambria" w:eastAsia="Cambria" w:cs="Cambria"/>
+        </w:rPr>
+        <w:t>d.hasImages.indicator</w:t>
+      </w:r>
+      <w:r>
+        <w:rPr>
+          <w:rFonts w:ascii="Cambria" w:hAnsi="Cambria" w:eastAsia="Cambria" w:cs="Cambria"/>
+        </w:rPr>
+        <w:t>.</w:t>
+      </w:r>
+      <w:r>
+        <w:rPr/>
+        <w:t xml:space="preserve"> battery</w:t>
+      </w:r>
+      <w:r>
+        <w:rPr>
+          <w:rFonts w:ascii="Cambria" w:hAnsi="Cambria" w:eastAsia="Cambria" w:cs="Cambria"/>
+        </w:rPr>
+        <w:t xml:space="preserve">}} </w:t>
+      </w:r>
+    </w:p>
+    <w:p>
+      <w:pPr>
+        <w:spacing w:before="240" w:after="240"/>
+        <w:rPr>
+          <w:rFonts w:ascii="Cambria" w:hAnsi="Cambria" w:eastAsia="Cambria" w:cs="Cambria"/>
+        </w:rPr>
+      </w:pPr>
+      <w:r>
+        <w:rPr>
+          <w:rFonts w:ascii="Cambria" w:hAnsi="Cambria" w:eastAsia="Cambria" w:cs="Cambria"/>
+        </w:rPr>
+        <w:t>Батарей</w:t>
+      </w:r>
+      <w:r>
+        <w:rPr>
+          <w:rFonts w:ascii="Cambria" w:hAnsi="Cambria" w:eastAsia="Cambria" w:cs="Cambria"/>
+        </w:rPr>
+        <w:t xml:space="preserve">: </w:t>
+      </w:r>
+    </w:p>
+    <w:p>
+      <w:pPr>
+        <w:pStyle w:val="Normal"/>
+        <w:spacing w:before="240" w:after="240"/>
+      </w:pPr>
+      <w:r>
+        <w:rPr>
+          <w:rFonts w:ascii="Cambria" w:hAnsi="Cambria" w:eastAsia="Cambria" w:cs="Cambria"/>
+        </w:rPr>
+        <w:t>{{#</w:t>
+      </w:r>
+      <w:r>
+        <w:rPr>
+          <w:rFonts w:ascii="Cambria" w:hAnsi="Cambria" w:eastAsia="Cambria" w:cs="Cambria"/>
+        </w:rPr>
+        <w:t>d.images</w:t>
+      </w:r>
+      <w:r>
+        <w:rPr>
+          <w:rFonts w:ascii="Cambria" w:hAnsi="Cambria" w:eastAsia="Cambria" w:cs="Cambria"/>
+        </w:rPr>
+        <w:t>.</w:t>
+      </w:r>
+      <w:r>
+        <w:rPr>
+          <w:rFonts w:ascii="Cambria" w:hAnsi="Cambria" w:eastAsia="Cambria" w:cs="Cambria"/>
+        </w:rPr>
+        <w:t>indicator.</w:t>
+      </w:r>
+      <w:r>
+        <w:rPr/>
+        <w:t xml:space="preserve"> battery</w:t>
+      </w:r>
+      <w:r>
+        <w:rPr>
+          <w:rFonts w:ascii="Cambria" w:hAnsi="Cambria" w:eastAsia="Cambria" w:cs="Cambria"/>
+        </w:rPr>
+        <w:t xml:space="preserve">}} </w:t>
+      </w:r>
+    </w:p>
+    <w:p w14:noSpellErr="1">
+      <w:pPr>
+        <w:pStyle w:val="Normal"/>
+        <w:spacing w:before="240" w:after="240"/>
+      </w:pPr>
+      <w:r>
+        <w:drawing>
+          <wp:inline wp14:editId="4DB3F620" wp14:anchorId="2B379ABF">
+            <wp:extent cx="2143125" cy="2143125"/>
+            <wp:effectExtent l="0" t="0" r="9525" b="9525"/>
+            <wp:docPr id="1066443084" name="Picture 1" descr="{{image}}"/>
+            <wp:cNvGraphicFramePr>
+              <a:graphicFrameLocks noChangeAspect="1"/>
+            </wp:cNvGraphicFramePr>
+            <a:graphic>
+              <a:graphicData xmlns:a="http://schemas.openxmlformats.org/drawingml/2006/main" uri="http://schemas.openxmlformats.org/drawingml/2006/picture">
+                <pic:pic xmlns:pic="http://schemas.openxmlformats.org/drawingml/2006/picture">
+                  <pic:nvPicPr>
+                    <pic:cNvPr id="829094576" name="Picture 1" descr="image"/>
+                    <pic:cNvPicPr/>
+                  </pic:nvPicPr>
+                  <pic:blipFill>
+                    <a:blip xmlns:r="http://schemas.openxmlformats.org/officeDocument/2006/relationships" r:embed="rId9"/>
+                    <a:stretch>
+                      <a:fillRect/>
+                    </a:stretch>
+                  </pic:blipFill>
+                  <pic:spPr>
+                    <a:xfrm>
+                      <a:off x="0" y="0"/>
+                      <a:ext cx="2143125" cy="2143125"/>
+                    </a:xfrm>
+                    <a:prstGeom prst="rect">
+                      <a:avLst/>
+                    </a:prstGeom>
+                  </pic:spPr>
+                </pic:pic>
+              </a:graphicData>
+            </a:graphic>
+          </wp:inline>
+        </w:drawing>
+      </w:r>
+    </w:p>
+    <w:p>
+      <w:pPr>
+        <w:pStyle w:val="Normal"/>
+        <w:spacing w:before="240" w:after="240"/>
+      </w:pPr>
+      <w:r>
+        <w:rPr>
+          <w:rFonts w:ascii="Cambria" w:hAnsi="Cambria" w:eastAsia="Cambria" w:cs="Cambria"/>
+        </w:rPr>
+        <w:t>{{/</w:t>
+      </w:r>
+      <w:r>
+        <w:rPr>
+          <w:rFonts w:ascii="Cambria" w:hAnsi="Cambria" w:eastAsia="Cambria" w:cs="Cambria"/>
+        </w:rPr>
+        <w:t>d.images.indicator.</w:t>
+      </w:r>
+      <w:r>
+        <w:rPr/>
+        <w:t xml:space="preserve"> battery</w:t>
+      </w:r>
+      <w:r>
+        <w:rPr>
+          <w:rFonts w:ascii="Cambria" w:hAnsi="Cambria" w:eastAsia="Cambria" w:cs="Cambria"/>
+        </w:rPr>
+        <w:t>}}</w:t>
+      </w:r>
+    </w:p>
+    <w:p>
+      <w:pPr>
+        <w:pStyle w:val="Normal"/>
+        <w:spacing w:before="240" w:after="240"/>
+      </w:pPr>
+      <w:r>
+        <w:rPr>
+          <w:rFonts w:ascii="Cambria" w:hAnsi="Cambria" w:eastAsia="Cambria" w:cs="Cambria"/>
+        </w:rPr>
         <w:t xml:space="preserve"> {{/</w:t>
       </w:r>
       <w:r>
         <w:rPr>
           <w:rFonts w:ascii="Cambria" w:hAnsi="Cambria" w:eastAsia="Cambria" w:cs="Cambria"/>
         </w:rPr>
-        <w:t>d.hasImages.indicator</w:t>
-      </w:r>
-      <w:r>
-        <w:rPr>
-          <w:rFonts w:ascii="Cambria" w:hAnsi="Cambria" w:eastAsia="Cambria" w:cs="Cambria"/>
-        </w:rPr>
-        <w:t>.</w:t>
-      </w:r>
-      <w:r>
-        <w:rPr>
-          <w:rFonts w:ascii="Cambria" w:hAnsi="Cambria" w:eastAsia="Cambria" w:cs="Cambria"/>
-        </w:rPr>
-        <w:t>serial</w:t>
-      </w:r>
-      <w:r>
-        <w:rPr>
-          <w:rFonts w:ascii="Cambria" w:hAnsi="Cambria" w:eastAsia="Cambria" w:cs="Cambria"/>
-        </w:rPr>
-        <w:t>_converter}}</w:t>
-      </w:r>
+        <w:t>d.hasImages.indicator.</w:t>
+      </w:r>
+      <w:r>
+        <w:rPr/>
+        <w:t xml:space="preserve"> battery</w:t>
+      </w:r>
+      <w:r>
+        <w:rPr>
+          <w:rFonts w:ascii="Cambria" w:hAnsi="Cambria" w:eastAsia="Cambria" w:cs="Cambria"/>
+        </w:rPr>
+        <w:t>}}</w:t>
+      </w:r>
+    </w:p>
+    <w:p>
+      <w:pPr>
+        <w:spacing w:before="240" w:after="240"/>
+        <w:rPr>
+          <w:rFonts w:ascii="Cambria" w:hAnsi="Cambria" w:eastAsia="Cambria" w:cs="Cambria"/>
+        </w:rPr>
+      </w:pPr>
     </w:p>
     <w:p>
       <w:pPr>
@@ -4706,6 +4476,7 @@
             <w:cnfStyle w:val="001000000000" w:firstRow="0" w:lastRow="0" w:firstColumn="1" w:lastColumn="0" w:oddVBand="0" w:evenVBand="0" w:oddHBand="0" w:evenHBand="0" w:firstRowFirstColumn="0" w:firstRowLastColumn="0" w:lastRowFirstColumn="0" w:lastRowLastColumn="0"/>
             <w:tcW w:w="447" w:type="dxa"/>
             <w:shd w:val="clear" w:color="auto" w:fill="2F75B5"/>
+            <w:tcMar/>
           </w:tcPr>
           <w:p>
             <w:pPr>
@@ -4721,8 +4492,10 @@
         </w:tc>
         <w:tc>
           <w:tcPr>
+            <w:cnfStyle w:val="000000000000" w:firstRow="0" w:lastRow="0" w:firstColumn="0" w:lastColumn="0" w:oddVBand="0" w:evenVBand="0" w:oddHBand="0" w:evenHBand="0" w:firstRowFirstColumn="0" w:firstRowLastColumn="0" w:lastRowFirstColumn="0" w:lastRowLastColumn="0"/>
             <w:tcW w:w="1551" w:type="dxa"/>
             <w:shd w:val="clear" w:color="auto" w:fill="2F75B5"/>
+            <w:tcMar/>
           </w:tcPr>
           <w:p>
             <w:pPr>
@@ -4754,8 +4527,10 @@
         </w:tc>
         <w:tc>
           <w:tcPr>
+            <w:cnfStyle w:val="000000000000" w:firstRow="0" w:lastRow="0" w:firstColumn="0" w:lastColumn="0" w:oddVBand="0" w:evenVBand="0" w:oddHBand="0" w:evenHBand="0" w:firstRowFirstColumn="0" w:firstRowLastColumn="0" w:lastRowFirstColumn="0" w:lastRowLastColumn="0"/>
             <w:tcW w:w="2250" w:type="dxa"/>
             <w:shd w:val="clear" w:color="auto" w:fill="2F75B5"/>
+            <w:tcMar/>
           </w:tcPr>
           <w:p>
             <w:pPr>
@@ -4774,8 +4549,10 @@
         </w:tc>
         <w:tc>
           <w:tcPr>
+            <w:cnfStyle w:val="000000000000" w:firstRow="0" w:lastRow="0" w:firstColumn="0" w:lastColumn="0" w:oddVBand="0" w:evenVBand="0" w:oddHBand="0" w:evenHBand="0" w:firstRowFirstColumn="0" w:firstRowLastColumn="0" w:lastRowFirstColumn="0" w:lastRowLastColumn="0"/>
             <w:tcW w:w="5130" w:type="dxa"/>
             <w:shd w:val="clear" w:color="auto" w:fill="2F75B5"/>
+            <w:tcMar/>
           </w:tcPr>
           <w:p>
             <w:pPr>
@@ -4807,6 +4584,7 @@
           <w:tcPr>
             <w:cnfStyle w:val="001000000000" w:firstRow="0" w:lastRow="0" w:firstColumn="1" w:lastColumn="0" w:oddVBand="0" w:evenVBand="0" w:oddHBand="0" w:evenHBand="0" w:firstRowFirstColumn="0" w:firstRowLastColumn="0" w:lastRowFirstColumn="0" w:lastRowLastColumn="0"/>
             <w:tcW w:w="447" w:type="dxa"/>
+            <w:tcMar/>
           </w:tcPr>
           <w:p>
             <w:r>
@@ -4816,7 +4594,9 @@
         </w:tc>
         <w:tc>
           <w:tcPr>
+            <w:cnfStyle w:val="000000000000" w:firstRow="0" w:lastRow="0" w:firstColumn="0" w:lastColumn="0" w:oddVBand="0" w:evenVBand="0" w:oddHBand="0" w:evenHBand="0" w:firstRowFirstColumn="0" w:firstRowLastColumn="0" w:lastRowFirstColumn="0" w:lastRowLastColumn="0"/>
             <w:tcW w:w="1551" w:type="dxa"/>
+            <w:tcMar/>
           </w:tcPr>
           <w:p>
             <w:pPr>
@@ -4855,7 +4635,9 @@
         </w:tc>
         <w:tc>
           <w:tcPr>
+            <w:cnfStyle w:val="000000000000" w:firstRow="0" w:lastRow="0" w:firstColumn="0" w:lastColumn="0" w:oddVBand="0" w:evenVBand="0" w:oddHBand="0" w:evenHBand="0" w:firstRowFirstColumn="0" w:firstRowLastColumn="0" w:lastRowFirstColumn="0" w:lastRowLastColumn="0"/>
             <w:tcW w:w="2250" w:type="dxa"/>
+            <w:tcMar/>
           </w:tcPr>
           <w:p>
             <w:pPr>
@@ -4888,7 +4670,9 @@
         </w:tc>
         <w:tc>
           <w:tcPr>
+            <w:cnfStyle w:val="000000000000" w:firstRow="0" w:lastRow="0" w:firstColumn="0" w:lastColumn="0" w:oddVBand="0" w:evenVBand="0" w:oddHBand="0" w:evenHBand="0" w:firstRowFirstColumn="0" w:firstRowLastColumn="0" w:lastRowFirstColumn="0" w:lastRowLastColumn="0"/>
             <w:tcW w:w="5130" w:type="dxa"/>
+            <w:tcMar/>
           </w:tcPr>
           <w:p>
             <w:pPr>
@@ -4928,6 +4712,7 @@
           <w:tcPr>
             <w:cnfStyle w:val="001000000000" w:firstRow="0" w:lastRow="0" w:firstColumn="1" w:lastColumn="0" w:oddVBand="0" w:evenVBand="0" w:oddHBand="0" w:evenHBand="0" w:firstRowFirstColumn="0" w:firstRowLastColumn="0" w:lastRowFirstColumn="0" w:lastRowLastColumn="0"/>
             <w:tcW w:w="447" w:type="dxa"/>
+            <w:tcMar/>
           </w:tcPr>
           <w:p>
             <w:r>
@@ -4937,7 +4722,9 @@
         </w:tc>
         <w:tc>
           <w:tcPr>
+            <w:cnfStyle w:val="000000000000" w:firstRow="0" w:lastRow="0" w:firstColumn="0" w:lastColumn="0" w:oddVBand="0" w:evenVBand="0" w:oddHBand="0" w:evenHBand="0" w:firstRowFirstColumn="0" w:firstRowLastColumn="0" w:lastRowFirstColumn="0" w:lastRowLastColumn="0"/>
             <w:tcW w:w="1551" w:type="dxa"/>
+            <w:tcMar/>
           </w:tcPr>
           <w:p>
             <w:pPr>
@@ -4956,7 +4743,9 @@
         </w:tc>
         <w:tc>
           <w:tcPr>
+            <w:cnfStyle w:val="000000000000" w:firstRow="0" w:lastRow="0" w:firstColumn="0" w:lastColumn="0" w:oddVBand="0" w:evenVBand="0" w:oddHBand="0" w:evenHBand="0" w:firstRowFirstColumn="0" w:firstRowLastColumn="0" w:lastRowFirstColumn="0" w:lastRowLastColumn="0"/>
             <w:tcW w:w="2250" w:type="dxa"/>
+            <w:tcMar/>
           </w:tcPr>
           <w:p>
             <w:pPr>
@@ -4994,7 +4783,9 @@
         </w:tc>
         <w:tc>
           <w:tcPr>
+            <w:cnfStyle w:val="000000000000" w:firstRow="0" w:lastRow="0" w:firstColumn="0" w:lastColumn="0" w:oddVBand="0" w:evenVBand="0" w:oddHBand="0" w:evenHBand="0" w:firstRowFirstColumn="0" w:firstRowLastColumn="0" w:lastRowFirstColumn="0" w:lastRowLastColumn="0"/>
             <w:tcW w:w="5130" w:type="dxa"/>
+            <w:tcMar/>
           </w:tcPr>
           <w:p>
             <w:pPr>
@@ -5039,6 +4830,7 @@
           <w:tcPr>
             <w:cnfStyle w:val="001000000000" w:firstRow="0" w:lastRow="0" w:firstColumn="1" w:lastColumn="0" w:oddVBand="0" w:evenVBand="0" w:oddHBand="0" w:evenHBand="0" w:firstRowFirstColumn="0" w:firstRowLastColumn="0" w:lastRowFirstColumn="0" w:lastRowLastColumn="0"/>
             <w:tcW w:w="447" w:type="dxa"/>
+            <w:tcMar/>
           </w:tcPr>
           <w:p>
             <w:r>
@@ -5048,7 +4840,9 @@
         </w:tc>
         <w:tc>
           <w:tcPr>
+            <w:cnfStyle w:val="000000000000" w:firstRow="0" w:lastRow="0" w:firstColumn="0" w:lastColumn="0" w:oddVBand="0" w:evenVBand="0" w:oddHBand="0" w:evenHBand="0" w:firstRowFirstColumn="0" w:firstRowLastColumn="0" w:lastRowFirstColumn="0" w:lastRowLastColumn="0"/>
             <w:tcW w:w="1551" w:type="dxa"/>
+            <w:tcMar/>
           </w:tcPr>
           <w:p>
             <w:pPr>
@@ -5079,7 +4873,9 @@
         </w:tc>
         <w:tc>
           <w:tcPr>
+            <w:cnfStyle w:val="000000000000" w:firstRow="0" w:lastRow="0" w:firstColumn="0" w:lastColumn="0" w:oddVBand="0" w:evenVBand="0" w:oddHBand="0" w:evenHBand="0" w:firstRowFirstColumn="0" w:firstRowLastColumn="0" w:lastRowFirstColumn="0" w:lastRowLastColumn="0"/>
             <w:tcW w:w="2250" w:type="dxa"/>
+            <w:tcMar/>
           </w:tcPr>
           <w:p>
             <w:pPr>
@@ -5117,7 +4913,9 @@
         </w:tc>
         <w:tc>
           <w:tcPr>
+            <w:cnfStyle w:val="000000000000" w:firstRow="0" w:lastRow="0" w:firstColumn="0" w:lastColumn="0" w:oddVBand="0" w:evenVBand="0" w:oddHBand="0" w:evenHBand="0" w:firstRowFirstColumn="0" w:firstRowLastColumn="0" w:lastRowFirstColumn="0" w:lastRowLastColumn="0"/>
             <w:tcW w:w="5130" w:type="dxa"/>
+            <w:tcMar/>
           </w:tcPr>
           <w:p>
             <w:pPr>
@@ -5162,6 +4960,7 @@
           <w:tcPr>
             <w:cnfStyle w:val="001000000000" w:firstRow="0" w:lastRow="0" w:firstColumn="1" w:lastColumn="0" w:oddVBand="0" w:evenVBand="0" w:oddHBand="0" w:evenHBand="0" w:firstRowFirstColumn="0" w:firstRowLastColumn="0" w:lastRowFirstColumn="0" w:lastRowLastColumn="0"/>
             <w:tcW w:w="447" w:type="dxa"/>
+            <w:tcMar/>
           </w:tcPr>
           <w:p>
             <w:r>
@@ -5171,7 +4970,9 @@
         </w:tc>
         <w:tc>
           <w:tcPr>
+            <w:cnfStyle w:val="000000000000" w:firstRow="0" w:lastRow="0" w:firstColumn="0" w:lastColumn="0" w:oddVBand="0" w:evenVBand="0" w:oddHBand="0" w:evenHBand="0" w:firstRowFirstColumn="0" w:firstRowLastColumn="0" w:lastRowFirstColumn="0" w:lastRowLastColumn="0"/>
             <w:tcW w:w="1551" w:type="dxa"/>
+            <w:tcMar/>
           </w:tcPr>
           <w:p>
             <w:pPr>
@@ -5194,7 +4995,9 @@
         </w:tc>
         <w:tc>
           <w:tcPr>
+            <w:cnfStyle w:val="000000000000" w:firstRow="0" w:lastRow="0" w:firstColumn="0" w:lastColumn="0" w:oddVBand="0" w:evenVBand="0" w:oddHBand="0" w:evenHBand="0" w:firstRowFirstColumn="0" w:firstRowLastColumn="0" w:lastRowFirstColumn="0" w:lastRowLastColumn="0"/>
             <w:tcW w:w="2250" w:type="dxa"/>
+            <w:tcMar/>
           </w:tcPr>
           <w:p>
             <w:pPr>
@@ -5232,7 +5035,9 @@
         </w:tc>
         <w:tc>
           <w:tcPr>
+            <w:cnfStyle w:val="000000000000" w:firstRow="0" w:lastRow="0" w:firstColumn="0" w:lastColumn="0" w:oddVBand="0" w:evenVBand="0" w:oddHBand="0" w:evenHBand="0" w:firstRowFirstColumn="0" w:firstRowLastColumn="0" w:lastRowFirstColumn="0" w:lastRowLastColumn="0"/>
             <w:tcW w:w="5130" w:type="dxa"/>
+            <w:tcMar/>
           </w:tcPr>
           <w:p>
             <w:pPr>
@@ -5277,6 +5082,7 @@
           <w:tcPr>
             <w:cnfStyle w:val="001000000000" w:firstRow="0" w:lastRow="0" w:firstColumn="1" w:lastColumn="0" w:oddVBand="0" w:evenVBand="0" w:oddHBand="0" w:evenHBand="0" w:firstRowFirstColumn="0" w:firstRowLastColumn="0" w:lastRowFirstColumn="0" w:lastRowLastColumn="0"/>
             <w:tcW w:w="447" w:type="dxa"/>
+            <w:tcMar/>
           </w:tcPr>
           <w:p>
             <w:r>
@@ -5286,46 +5092,53 @@
         </w:tc>
         <w:tc>
           <w:tcPr>
+            <w:cnfStyle w:val="000000000000" w:firstRow="0" w:lastRow="0" w:firstColumn="0" w:lastColumn="0" w:oddVBand="0" w:evenVBand="0" w:oddHBand="0" w:evenHBand="0" w:firstRowFirstColumn="0" w:firstRowLastColumn="0" w:lastRowFirstColumn="0" w:lastRowLastColumn="0"/>
             <w:tcW w:w="1551" w:type="dxa"/>
+            <w:tcMar/>
           </w:tcPr>
           <w:p>
             <w:pPr>
               <w:cnfStyle w:val="000000100000" w:firstRow="0" w:lastRow="0" w:firstColumn="0" w:lastColumn="0" w:oddVBand="0" w:evenVBand="0" w:oddHBand="1" w:evenHBand="0" w:firstRowFirstColumn="0" w:firstRowLastColumn="0" w:lastRowFirstColumn="0" w:lastRowLastColumn="0"/>
             </w:pPr>
-            <w:proofErr w:type="spellStart"/>
-            <w:r>
+            <w:r>
+              <w:rPr/>
               <w:t>Холбогч</w:t>
             </w:r>
-            <w:proofErr w:type="spellEnd"/>
-            <w:r>
+            <w:r>
+              <w:rPr/>
               <w:t xml:space="preserve"> </w:t>
             </w:r>
-            <w:proofErr w:type="spellStart"/>
-            <w:r>
+            <w:r>
+              <w:rPr/>
               <w:t>хайрцагны</w:t>
             </w:r>
-            <w:proofErr w:type="spellEnd"/>
-            <w:r>
+            <w:r>
+              <w:rPr/>
               <w:t xml:space="preserve"> </w:t>
             </w:r>
-            <w:proofErr w:type="spellStart"/>
-            <w:r>
+            <w:r>
+              <w:rPr/>
               <w:t>хамгаалалтын</w:t>
             </w:r>
-            <w:proofErr w:type="spellEnd"/>
-            <w:r>
+            <w:r>
+              <w:rPr/>
+              <w:t xml:space="preserve"> гадна </w:t>
+            </w:r>
+            <w:r>
+              <w:rPr/>
               <w:t xml:space="preserve"> </w:t>
             </w:r>
-            <w:proofErr w:type="spellStart"/>
-            <w:r>
+            <w:r>
+              <w:rPr/>
               <w:t>хайрцаг</w:t>
             </w:r>
-            <w:proofErr w:type="spellEnd"/>
           </w:p>
         </w:tc>
         <w:tc>
           <w:tcPr>
+            <w:cnfStyle w:val="000000000000" w:firstRow="0" w:lastRow="0" w:firstColumn="0" w:lastColumn="0" w:oddVBand="0" w:evenVBand="0" w:oddHBand="0" w:evenHBand="0" w:firstRowFirstColumn="0" w:firstRowLastColumn="0" w:lastRowFirstColumn="0" w:lastRowLastColumn="0"/>
             <w:tcW w:w="2250" w:type="dxa"/>
+            <w:tcMar/>
           </w:tcPr>
           <w:p>
             <w:pPr>
@@ -5366,7 +5179,9 @@
         </w:tc>
         <w:tc>
           <w:tcPr>
+            <w:cnfStyle w:val="000000000000" w:firstRow="0" w:lastRow="0" w:firstColumn="0" w:lastColumn="0" w:oddVBand="0" w:evenVBand="0" w:oddHBand="0" w:evenHBand="0" w:firstRowFirstColumn="0" w:firstRowLastColumn="0" w:lastRowFirstColumn="0" w:lastRowLastColumn="0"/>
             <w:tcW w:w="5130" w:type="dxa"/>
+            <w:tcMar/>
           </w:tcPr>
           <w:p>
             <w:pPr>
@@ -5850,7 +5665,12 @@
     </w:p>
     <w:p>
       <w:r>
-        <w:t>Холбогч хайрцагны хамгаалалтын хайрцаг:</w:t>
+        <w:rPr/>
+        <w:t>Холбогч хайрцагны хамгаалалтын гадна хайрцаг</w:t>
+      </w:r>
+      <w:r>
+        <w:rPr/>
+        <w:t>:</w:t>
       </w:r>
     </w:p>
     <w:p>
@@ -7535,6 +7355,7 @@
             <w:cnfStyle w:val="001000000000" w:firstRow="0" w:lastRow="0" w:firstColumn="1" w:lastColumn="0" w:oddVBand="0" w:evenVBand="0" w:oddHBand="0" w:evenHBand="0" w:firstRowFirstColumn="0" w:firstRowLastColumn="0" w:lastRowFirstColumn="0" w:lastRowLastColumn="0"/>
             <w:tcW w:w="447" w:type="dxa"/>
             <w:shd w:val="clear" w:color="auto" w:fill="2F75B5"/>
+            <w:tcMar/>
           </w:tcPr>
           <w:p>
             <w:pPr>
@@ -7550,8 +7371,10 @@
         </w:tc>
         <w:tc>
           <w:tcPr>
+            <w:cnfStyle w:val="000000000000" w:firstRow="0" w:lastRow="0" w:firstColumn="0" w:lastColumn="0" w:oddVBand="0" w:evenVBand="0" w:oddHBand="0" w:evenHBand="0" w:firstRowFirstColumn="0" w:firstRowLastColumn="0" w:lastRowFirstColumn="0" w:lastRowLastColumn="0"/>
             <w:tcW w:w="1461" w:type="dxa"/>
             <w:shd w:val="clear" w:color="auto" w:fill="2F75B5"/>
+            <w:tcMar/>
           </w:tcPr>
           <w:p>
             <w:pPr>
@@ -7583,8 +7406,10 @@
         </w:tc>
         <w:tc>
           <w:tcPr>
+            <w:cnfStyle w:val="000000000000" w:firstRow="0" w:lastRow="0" w:firstColumn="0" w:lastColumn="0" w:oddVBand="0" w:evenVBand="0" w:oddHBand="0" w:evenHBand="0" w:firstRowFirstColumn="0" w:firstRowLastColumn="0" w:lastRowFirstColumn="0" w:lastRowLastColumn="0"/>
             <w:tcW w:w="2340" w:type="dxa"/>
             <w:shd w:val="clear" w:color="auto" w:fill="2F75B5"/>
+            <w:tcMar/>
           </w:tcPr>
           <w:p>
             <w:pPr>
@@ -7603,8 +7428,10 @@
         </w:tc>
         <w:tc>
           <w:tcPr>
+            <w:cnfStyle w:val="000000000000" w:firstRow="0" w:lastRow="0" w:firstColumn="0" w:lastColumn="0" w:oddVBand="0" w:evenVBand="0" w:oddHBand="0" w:evenHBand="0" w:firstRowFirstColumn="0" w:firstRowLastColumn="0" w:lastRowFirstColumn="0" w:lastRowLastColumn="0"/>
             <w:tcW w:w="5130" w:type="dxa"/>
             <w:shd w:val="clear" w:color="auto" w:fill="2F75B5"/>
+            <w:tcMar/>
           </w:tcPr>
           <w:p>
             <w:pPr>
@@ -7636,6 +7463,7 @@
           <w:tcPr>
             <w:cnfStyle w:val="001000000000" w:firstRow="0" w:lastRow="0" w:firstColumn="1" w:lastColumn="0" w:oddVBand="0" w:evenVBand="0" w:oddHBand="0" w:evenHBand="0" w:firstRowFirstColumn="0" w:firstRowLastColumn="0" w:lastRowFirstColumn="0" w:lastRowLastColumn="0"/>
             <w:tcW w:w="447" w:type="dxa"/>
+            <w:tcMar/>
           </w:tcPr>
           <w:p>
             <w:r>
@@ -7645,7 +7473,9 @@
         </w:tc>
         <w:tc>
           <w:tcPr>
+            <w:cnfStyle w:val="000000000000" w:firstRow="0" w:lastRow="0" w:firstColumn="0" w:lastColumn="0" w:oddVBand="0" w:evenVBand="0" w:oddHBand="0" w:evenHBand="0" w:firstRowFirstColumn="0" w:firstRowLastColumn="0" w:lastRowFirstColumn="0" w:lastRowLastColumn="0"/>
             <w:tcW w:w="1461" w:type="dxa"/>
+            <w:tcMar/>
           </w:tcPr>
           <w:p>
             <w:pPr>
@@ -7668,7 +7498,9 @@
         </w:tc>
         <w:tc>
           <w:tcPr>
+            <w:cnfStyle w:val="000000000000" w:firstRow="0" w:lastRow="0" w:firstColumn="0" w:lastColumn="0" w:oddVBand="0" w:evenVBand="0" w:oddHBand="0" w:evenHBand="0" w:firstRowFirstColumn="0" w:firstRowLastColumn="0" w:lastRowFirstColumn="0" w:lastRowLastColumn="0"/>
             <w:tcW w:w="2340" w:type="dxa"/>
+            <w:tcMar/>
           </w:tcPr>
           <w:p>
             <w:pPr>
@@ -7706,7 +7538,9 @@
         </w:tc>
         <w:tc>
           <w:tcPr>
+            <w:cnfStyle w:val="000000000000" w:firstRow="0" w:lastRow="0" w:firstColumn="0" w:lastColumn="0" w:oddVBand="0" w:evenVBand="0" w:oddHBand="0" w:evenHBand="0" w:firstRowFirstColumn="0" w:firstRowLastColumn="0" w:lastRowFirstColumn="0" w:lastRowLastColumn="0"/>
             <w:tcW w:w="5130" w:type="dxa"/>
+            <w:tcMar/>
           </w:tcPr>
           <w:p>
             <w:pPr>
@@ -7751,6 +7585,7 @@
           <w:tcPr>
             <w:cnfStyle w:val="001000000000" w:firstRow="0" w:lastRow="0" w:firstColumn="1" w:lastColumn="0" w:oddVBand="0" w:evenVBand="0" w:oddHBand="0" w:evenHBand="0" w:firstRowFirstColumn="0" w:firstRowLastColumn="0" w:lastRowFirstColumn="0" w:lastRowLastColumn="0"/>
             <w:tcW w:w="447" w:type="dxa"/>
+            <w:tcMar/>
           </w:tcPr>
           <w:p>
             <w:r>
@@ -7760,7 +7595,9 @@
         </w:tc>
         <w:tc>
           <w:tcPr>
+            <w:cnfStyle w:val="000000000000" w:firstRow="0" w:lastRow="0" w:firstColumn="0" w:lastColumn="0" w:oddVBand="0" w:evenVBand="0" w:oddHBand="0" w:evenHBand="0" w:firstRowFirstColumn="0" w:firstRowLastColumn="0" w:lastRowFirstColumn="0" w:lastRowLastColumn="0"/>
             <w:tcW w:w="1461" w:type="dxa"/>
+            <w:tcMar/>
           </w:tcPr>
           <w:p>
             <w:pPr>
@@ -7791,7 +7628,9 @@
         </w:tc>
         <w:tc>
           <w:tcPr>
+            <w:cnfStyle w:val="000000000000" w:firstRow="0" w:lastRow="0" w:firstColumn="0" w:lastColumn="0" w:oddVBand="0" w:evenVBand="0" w:oddHBand="0" w:evenHBand="0" w:firstRowFirstColumn="0" w:firstRowLastColumn="0" w:lastRowFirstColumn="0" w:lastRowLastColumn="0"/>
             <w:tcW w:w="2340" w:type="dxa"/>
+            <w:tcMar/>
           </w:tcPr>
           <w:p>
             <w:pPr>
@@ -7829,7 +7668,9 @@
         </w:tc>
         <w:tc>
           <w:tcPr>
+            <w:cnfStyle w:val="000000000000" w:firstRow="0" w:lastRow="0" w:firstColumn="0" w:lastColumn="0" w:oddVBand="0" w:evenVBand="0" w:oddHBand="0" w:evenHBand="0" w:firstRowFirstColumn="0" w:firstRowLastColumn="0" w:lastRowFirstColumn="0" w:lastRowLastColumn="0"/>
             <w:tcW w:w="5130" w:type="dxa"/>
+            <w:tcMar/>
           </w:tcPr>
           <w:p>
             <w:pPr>
@@ -7874,6 +7715,7 @@
           <w:tcPr>
             <w:cnfStyle w:val="001000000000" w:firstRow="0" w:lastRow="0" w:firstColumn="1" w:lastColumn="0" w:oddVBand="0" w:evenVBand="0" w:oddHBand="0" w:evenHBand="0" w:firstRowFirstColumn="0" w:firstRowLastColumn="0" w:lastRowFirstColumn="0" w:lastRowLastColumn="0"/>
             <w:tcW w:w="447" w:type="dxa"/>
+            <w:tcMar/>
           </w:tcPr>
           <w:p>
             <w:r>
@@ -7883,7 +7725,9 @@
         </w:tc>
         <w:tc>
           <w:tcPr>
+            <w:cnfStyle w:val="000000000000" w:firstRow="0" w:lastRow="0" w:firstColumn="0" w:lastColumn="0" w:oddVBand="0" w:evenVBand="0" w:oddHBand="0" w:evenHBand="0" w:firstRowFirstColumn="0" w:firstRowLastColumn="0" w:lastRowFirstColumn="0" w:lastRowLastColumn="0"/>
             <w:tcW w:w="1461" w:type="dxa"/>
+            <w:tcMar/>
           </w:tcPr>
           <w:p>
             <w:pPr>
@@ -7906,7 +7750,9 @@
         </w:tc>
         <w:tc>
           <w:tcPr>
+            <w:cnfStyle w:val="000000000000" w:firstRow="0" w:lastRow="0" w:firstColumn="0" w:lastColumn="0" w:oddVBand="0" w:evenVBand="0" w:oddHBand="0" w:evenHBand="0" w:firstRowFirstColumn="0" w:firstRowLastColumn="0" w:lastRowFirstColumn="0" w:lastRowLastColumn="0"/>
             <w:tcW w:w="2340" w:type="dxa"/>
+            <w:tcMar/>
           </w:tcPr>
           <w:p>
             <w:pPr>
@@ -7944,7 +7790,9 @@
         </w:tc>
         <w:tc>
           <w:tcPr>
+            <w:cnfStyle w:val="000000000000" w:firstRow="0" w:lastRow="0" w:firstColumn="0" w:lastColumn="0" w:oddVBand="0" w:evenVBand="0" w:oddHBand="0" w:evenHBand="0" w:firstRowFirstColumn="0" w:firstRowLastColumn="0" w:lastRowFirstColumn="0" w:lastRowLastColumn="0"/>
             <w:tcW w:w="5130" w:type="dxa"/>
+            <w:tcMar/>
           </w:tcPr>
           <w:p>
             <w:pPr>
@@ -7989,6 +7837,7 @@
           <w:tcPr>
             <w:cnfStyle w:val="001000000000" w:firstRow="0" w:lastRow="0" w:firstColumn="1" w:lastColumn="0" w:oddVBand="0" w:evenVBand="0" w:oddHBand="0" w:evenHBand="0" w:firstRowFirstColumn="0" w:firstRowLastColumn="0" w:lastRowFirstColumn="0" w:lastRowLastColumn="0"/>
             <w:tcW w:w="447" w:type="dxa"/>
+            <w:tcMar/>
           </w:tcPr>
           <w:p>
             <w:r>
@@ -7998,7 +7847,9 @@
         </w:tc>
         <w:tc>
           <w:tcPr>
+            <w:cnfStyle w:val="000000000000" w:firstRow="0" w:lastRow="0" w:firstColumn="0" w:lastColumn="0" w:oddVBand="0" w:evenVBand="0" w:oddHBand="0" w:evenHBand="0" w:firstRowFirstColumn="0" w:firstRowLastColumn="0" w:lastRowFirstColumn="0" w:lastRowLastColumn="0"/>
             <w:tcW w:w="1461" w:type="dxa"/>
+            <w:tcMar/>
           </w:tcPr>
           <w:p>
             <w:pPr>
@@ -8021,7 +7872,9 @@
         </w:tc>
         <w:tc>
           <w:tcPr>
+            <w:cnfStyle w:val="000000000000" w:firstRow="0" w:lastRow="0" w:firstColumn="0" w:lastColumn="0" w:oddVBand="0" w:evenVBand="0" w:oddHBand="0" w:evenHBand="0" w:firstRowFirstColumn="0" w:firstRowLastColumn="0" w:lastRowFirstColumn="0" w:lastRowLastColumn="0"/>
             <w:tcW w:w="2340" w:type="dxa"/>
+            <w:tcMar/>
           </w:tcPr>
           <w:p>
             <w:pPr>
@@ -8059,7 +7912,9 @@
         </w:tc>
         <w:tc>
           <w:tcPr>
+            <w:cnfStyle w:val="000000000000" w:firstRow="0" w:lastRow="0" w:firstColumn="0" w:lastColumn="0" w:oddVBand="0" w:evenVBand="0" w:oddHBand="0" w:evenHBand="0" w:firstRowFirstColumn="0" w:firstRowLastColumn="0" w:lastRowFirstColumn="0" w:lastRowLastColumn="0"/>
             <w:tcW w:w="5130" w:type="dxa"/>
+            <w:tcMar/>
           </w:tcPr>
           <w:p>
             <w:pPr>
@@ -8104,6 +7959,7 @@
           <w:tcPr>
             <w:cnfStyle w:val="001000000000" w:firstRow="0" w:lastRow="0" w:firstColumn="1" w:lastColumn="0" w:oddVBand="0" w:evenVBand="0" w:oddHBand="0" w:evenHBand="0" w:firstRowFirstColumn="0" w:firstRowLastColumn="0" w:lastRowFirstColumn="0" w:lastRowLastColumn="0"/>
             <w:tcW w:w="447" w:type="dxa"/>
+            <w:tcMar/>
           </w:tcPr>
           <w:p>
             <w:r>
@@ -8113,7 +7969,9 @@
         </w:tc>
         <w:tc>
           <w:tcPr>
+            <w:cnfStyle w:val="000000000000" w:firstRow="0" w:lastRow="0" w:firstColumn="0" w:lastColumn="0" w:oddVBand="0" w:evenVBand="0" w:oddHBand="0" w:evenHBand="0" w:firstRowFirstColumn="0" w:firstRowLastColumn="0" w:lastRowFirstColumn="0" w:lastRowLastColumn="0"/>
             <w:tcW w:w="1461" w:type="dxa"/>
+            <w:tcMar/>
           </w:tcPr>
           <w:p>
             <w:pPr>
@@ -8128,7 +7986,9 @@
         </w:tc>
         <w:tc>
           <w:tcPr>
+            <w:cnfStyle w:val="000000000000" w:firstRow="0" w:lastRow="0" w:firstColumn="0" w:lastColumn="0" w:oddVBand="0" w:evenVBand="0" w:oddHBand="0" w:evenHBand="0" w:firstRowFirstColumn="0" w:firstRowLastColumn="0" w:lastRowFirstColumn="0" w:lastRowLastColumn="0"/>
             <w:tcW w:w="2340" w:type="dxa"/>
+            <w:tcMar/>
           </w:tcPr>
           <w:p>
             <w:pPr>
@@ -8166,7 +8026,9 @@
         </w:tc>
         <w:tc>
           <w:tcPr>
+            <w:cnfStyle w:val="000000000000" w:firstRow="0" w:lastRow="0" w:firstColumn="0" w:lastColumn="0" w:oddVBand="0" w:evenVBand="0" w:oddHBand="0" w:evenHBand="0" w:firstRowFirstColumn="0" w:firstRowLastColumn="0" w:lastRowFirstColumn="0" w:lastRowLastColumn="0"/>
             <w:tcW w:w="5130" w:type="dxa"/>
+            <w:tcMar/>
           </w:tcPr>
           <w:p>
             <w:pPr>
@@ -8211,6 +8073,7 @@
           <w:tcPr>
             <w:cnfStyle w:val="001000000000" w:firstRow="0" w:lastRow="0" w:firstColumn="1" w:lastColumn="0" w:oddVBand="0" w:evenVBand="0" w:oddHBand="0" w:evenHBand="0" w:firstRowFirstColumn="0" w:firstRowLastColumn="0" w:lastRowFirstColumn="0" w:lastRowLastColumn="0"/>
             <w:tcW w:w="447" w:type="dxa"/>
+            <w:tcMar/>
           </w:tcPr>
           <w:p>
             <w:r>
@@ -8220,7 +8083,9 @@
         </w:tc>
         <w:tc>
           <w:tcPr>
+            <w:cnfStyle w:val="000000000000" w:firstRow="0" w:lastRow="0" w:firstColumn="0" w:lastColumn="0" w:oddVBand="0" w:evenVBand="0" w:oddHBand="0" w:evenHBand="0" w:firstRowFirstColumn="0" w:firstRowLastColumn="0" w:lastRowFirstColumn="0" w:lastRowLastColumn="0"/>
             <w:tcW w:w="1461" w:type="dxa"/>
+            <w:tcMar/>
           </w:tcPr>
           <w:p>
             <w:pPr>
@@ -8243,7 +8108,9 @@
         </w:tc>
         <w:tc>
           <w:tcPr>
+            <w:cnfStyle w:val="000000000000" w:firstRow="0" w:lastRow="0" w:firstColumn="0" w:lastColumn="0" w:oddVBand="0" w:evenVBand="0" w:oddHBand="0" w:evenHBand="0" w:firstRowFirstColumn="0" w:firstRowLastColumn="0" w:lastRowFirstColumn="0" w:lastRowLastColumn="0"/>
             <w:tcW w:w="2340" w:type="dxa"/>
+            <w:tcMar/>
           </w:tcPr>
           <w:p>
             <w:pPr>
@@ -8281,7 +8148,9 @@
         </w:tc>
         <w:tc>
           <w:tcPr>
+            <w:cnfStyle w:val="000000000000" w:firstRow="0" w:lastRow="0" w:firstColumn="0" w:lastColumn="0" w:oddVBand="0" w:evenVBand="0" w:oddHBand="0" w:evenHBand="0" w:firstRowFirstColumn="0" w:firstRowLastColumn="0" w:lastRowFirstColumn="0" w:lastRowLastColumn="0"/>
             <w:tcW w:w="5130" w:type="dxa"/>
+            <w:tcMar/>
           </w:tcPr>
           <w:p>
             <w:pPr>
@@ -8315,6 +8184,117 @@
             <w:r>
               <w:t>}</w:t>
             </w:r>
+          </w:p>
+        </w:tc>
+      </w:tr>
+      <w:tr>
+        <w:trPr>
+          <w:cnfStyle w:val="000000010000" w:firstRow="0" w:lastRow="0" w:firstColumn="0" w:lastColumn="0" w:oddVBand="0" w:evenVBand="0" w:oddHBand="0" w:evenHBand="1" w:firstRowFirstColumn="0" w:firstRowLastColumn="0" w:lastRowFirstColumn="0" w:lastRowLastColumn="0"/>
+          <w:trHeight w:val="300"/>
+        </w:trPr>
+        <w:tc>
+          <w:tcPr>
+            <w:cnfStyle w:val="001000000000" w:firstRow="0" w:lastRow="0" w:firstColumn="1" w:lastColumn="0" w:oddVBand="0" w:evenVBand="0" w:oddHBand="0" w:evenHBand="0" w:firstRowFirstColumn="0" w:firstRowLastColumn="0" w:lastRowFirstColumn="0" w:lastRowLastColumn="0"/>
+            <w:tcW w:w="447" w:type="dxa"/>
+            <w:tcMar/>
+          </w:tcPr>
+          <w:p>
+            <w:pPr>
+              <w:pStyle w:val="Normal"/>
+            </w:pPr>
+            <w:r>
+              <w:rPr/>
+              <w:t>7</w:t>
+            </w:r>
+          </w:p>
+        </w:tc>
+        <w:tc>
+          <w:tcPr>
+            <w:cnfStyle w:val="000000000000" w:firstRow="0" w:lastRow="0" w:firstColumn="0" w:lastColumn="0" w:oddVBand="0" w:evenVBand="0" w:oddHBand="0" w:evenHBand="0" w:firstRowFirstColumn="0" w:firstRowLastColumn="0" w:lastRowFirstColumn="0" w:lastRowLastColumn="0"/>
+            <w:tcW w:w="1461" w:type="dxa"/>
+            <w:tcMar/>
+          </w:tcPr>
+          <w:p>
+            <w:pPr>
+              <w:pStyle w:val="Normal"/>
+            </w:pPr>
+            <w:r>
+              <w:rPr/>
+              <w:t>Мэдрэгчийн суурь</w:t>
+            </w:r>
+          </w:p>
+        </w:tc>
+        <w:tc>
+          <w:tcPr>
+            <w:cnfStyle w:val="000000000000" w:firstRow="0" w:lastRow="0" w:firstColumn="0" w:lastColumn="0" w:oddVBand="0" w:evenVBand="0" w:oddHBand="0" w:evenHBand="0" w:firstRowFirstColumn="0" w:firstRowLastColumn="0" w:lastRowFirstColumn="0" w:lastRowLastColumn="0"/>
+            <w:tcW w:w="2340" w:type="dxa"/>
+            <w:tcMar/>
+          </w:tcPr>
+          <w:p>
+            <w:r>
+              <w:rPr/>
+              <w:t>{{</w:t>
+            </w:r>
+            <w:r>
+              <w:rPr/>
+              <w:t>d.foundation</w:t>
+            </w:r>
+            <w:r>
+              <w:rPr/>
+              <w:t>.</w:t>
+            </w:r>
+            <w:r>
+              <w:rPr/>
+              <w:t>sensor_base.status</w:t>
+            </w:r>
+            <w:r>
+              <w:rPr/>
+              <w:t>}}</w:t>
+            </w:r>
+          </w:p>
+          <w:p>
+            <w:pPr>
+              <w:pStyle w:val="Normal"/>
+            </w:pPr>
+          </w:p>
+        </w:tc>
+        <w:tc>
+          <w:tcPr>
+            <w:cnfStyle w:val="000000000000" w:firstRow="0" w:lastRow="0" w:firstColumn="0" w:lastColumn="0" w:oddVBand="0" w:evenVBand="0" w:oddHBand="0" w:evenHBand="0" w:firstRowFirstColumn="0" w:firstRowLastColumn="0" w:lastRowFirstColumn="0" w:lastRowLastColumn="0"/>
+            <w:tcW w:w="5130" w:type="dxa"/>
+            <w:tcMar/>
+          </w:tcPr>
+          <w:p>
+            <w:r>
+              <w:rPr/>
+              <w:t>{{</w:t>
+            </w:r>
+            <w:r>
+              <w:rPr/>
+              <w:t>d.foundation</w:t>
+            </w:r>
+            <w:r>
+              <w:rPr/>
+              <w:t xml:space="preserve">. </w:t>
+            </w:r>
+            <w:r>
+              <w:rPr/>
+              <w:t>sensor_base.comment</w:t>
+            </w:r>
+            <w:r>
+              <w:rPr/>
+              <w:t>}}</w:t>
+            </w:r>
+          </w:p>
+          <w:p>
+            <w:pPr>
+              <w:pStyle w:val="Normal"/>
+            </w:pPr>
+          </w:p>
+          <w:p>
+            <w:pPr>
+              <w:pStyle w:val="Normal"/>
+            </w:pPr>
           </w:p>
         </w:tc>
       </w:tr>
@@ -9033,27 +9013,151 @@
         </w:rPr>
         <w:t>{{/</w:t>
       </w:r>
-      <w:proofErr w:type="spellStart"/>
-      <w:proofErr w:type="gramStart"/>
       <w:r>
         <w:rPr>
           <w:lang w:val="fr-FR"/>
         </w:rPr>
         <w:t>d.hasImages.foundation</w:t>
       </w:r>
-      <w:proofErr w:type="gramEnd"/>
       <w:r>
         <w:rPr>
           <w:lang w:val="fr-FR"/>
         </w:rPr>
         <w:t>.slab_base</w:t>
       </w:r>
-      <w:proofErr w:type="spellEnd"/>
       <w:r>
         <w:rPr>
           <w:lang w:val="fr-FR"/>
         </w:rPr>
         <w:t>}}</w:t>
+      </w:r>
+    </w:p>
+    <w:p>
+      <w:pPr>
+        <w:pStyle w:val="Normal"/>
+      </w:pPr>
+      <w:r>
+        <w:rPr/>
+        <w:t>{{#</w:t>
+      </w:r>
+      <w:r>
+        <w:rPr/>
+        <w:t>d.hasImages.foundation</w:t>
+      </w:r>
+      <w:r>
+        <w:rPr/>
+        <w:t xml:space="preserve">. sensor </w:t>
+      </w:r>
+      <w:r>
+        <w:rPr/>
+        <w:t>_base}}</w:t>
+      </w:r>
+    </w:p>
+    <w:p>
+      <w:r>
+        <w:rPr/>
+        <w:t>Мэдрэгчийн</w:t>
+      </w:r>
+      <w:r>
+        <w:rPr/>
+        <w:t xml:space="preserve"> </w:t>
+      </w:r>
+      <w:r>
+        <w:rPr/>
+        <w:t>суурь:</w:t>
+      </w:r>
+    </w:p>
+    <w:p>
+      <w:pPr>
+        <w:pStyle w:val="Normal"/>
+      </w:pPr>
+      <w:r>
+        <w:rPr/>
+        <w:t>{{#</w:t>
+      </w:r>
+      <w:r>
+        <w:rPr/>
+        <w:t>d.images</w:t>
+      </w:r>
+      <w:r>
+        <w:rPr/>
+        <w:t>.</w:t>
+      </w:r>
+      <w:r>
+        <w:rPr/>
+        <w:t xml:space="preserve">foundation. sensor </w:t>
+      </w:r>
+      <w:r>
+        <w:rPr/>
+        <w:t>_base}}</w:t>
+      </w:r>
+    </w:p>
+    <w:p w14:noSpellErr="1">
+      <w:pPr>
+        <w:pStyle w:val="Normal"/>
+      </w:pPr>
+      <w:r>
+        <w:drawing>
+          <wp:inline wp14:editId="5F42E7AE" wp14:anchorId="62923898">
+            <wp:extent cx="2143125" cy="2143125"/>
+            <wp:effectExtent l="0" t="0" r="9525" b="9525"/>
+            <wp:docPr id="705410063" name="Picture 1" descr="{{image}}"/>
+            <wp:cNvGraphicFramePr>
+              <a:graphicFrameLocks noChangeAspect="1"/>
+            </wp:cNvGraphicFramePr>
+            <a:graphic>
+              <a:graphicData xmlns:a="http://schemas.openxmlformats.org/drawingml/2006/main" uri="http://schemas.openxmlformats.org/drawingml/2006/picture">
+                <pic:pic xmlns:pic="http://schemas.openxmlformats.org/drawingml/2006/picture">
+                  <pic:nvPicPr>
+                    <pic:cNvPr id="829094576" name="Picture 1" descr="image"/>
+                    <pic:cNvPicPr/>
+                  </pic:nvPicPr>
+                  <pic:blipFill>
+                    <a:blip xmlns:r="http://schemas.openxmlformats.org/officeDocument/2006/relationships" r:embed="rId9"/>
+                    <a:stretch>
+                      <a:fillRect/>
+                    </a:stretch>
+                  </pic:blipFill>
+                  <pic:spPr>
+                    <a:xfrm>
+                      <a:off x="0" y="0"/>
+                      <a:ext cx="2143125" cy="2143125"/>
+                    </a:xfrm>
+                    <a:prstGeom prst="rect">
+                      <a:avLst/>
+                    </a:prstGeom>
+                  </pic:spPr>
+                </pic:pic>
+              </a:graphicData>
+            </a:graphic>
+          </wp:inline>
+        </w:drawing>
+      </w:r>
+    </w:p>
+    <w:p>
+      <w:pPr>
+        <w:pStyle w:val="Normal"/>
+      </w:pPr>
+      <w:r>
+        <w:rPr/>
+        <w:t>{{/</w:t>
+      </w:r>
+      <w:r>
+        <w:rPr/>
+        <w:t>d.images.foundation. sensor _base</w:t>
+      </w:r>
+      <w:r>
+        <w:rPr/>
+        <w:t>}}</w:t>
+      </w:r>
+    </w:p>
+    <w:p>
+      <w:pPr>
+        <w:pStyle w:val="Normal"/>
+      </w:pPr>
+      <w:r>
+        <w:rPr/>
+        <w:t>{{/d.hasImages.foundation.sensor_base}}</w:t>
       </w:r>
     </w:p>
     <w:p>

</xml_diff>